<commit_message>
Actualiza horario retroalimentación Plantilla 4 (15:15-15:30)
</commit_message>
<xml_diff>
--- a/plantillas/Plantilla_4_MatrizIndicadores.docx
+++ b/plantillas/Plantilla_4_MatrizIndicadores.docx
@@ -249,12 +249,6 @@
               <w:bottom w:val="single" w:sz="4" w:space="0" w:color="000000"/>
               <w:right w:val="single" w:sz="4" w:space="0" w:color="000000"/>
             </w:tcBorders>
-            <w:tcBorders>
-              <w:top w:val="single" w:sz="4" w:space="0" w:color="000000"/>
-              <w:left w:val="single" w:sz="4" w:space="0" w:color="000000"/>
-              <w:bottom w:val="single" w:sz="4" w:space="0" w:color="000000"/>
-              <w:right w:val="single" w:sz="4" w:space="0" w:color="000000"/>
-            </w:tcBorders>
           </w:tcPr>
           <w:p>
             <w:pPr>
@@ -273,12 +267,6 @@
               <w:bottom w:val="single" w:sz="4" w:space="0" w:color="000000"/>
               <w:right w:val="single" w:sz="4" w:space="0" w:color="000000"/>
             </w:tcBorders>
-            <w:tcBorders>
-              <w:top w:val="single" w:sz="4" w:space="0" w:color="000000"/>
-              <w:left w:val="single" w:sz="4" w:space="0" w:color="000000"/>
-              <w:bottom w:val="single" w:sz="4" w:space="0" w:color="000000"/>
-              <w:right w:val="single" w:sz="4" w:space="0" w:color="000000"/>
-            </w:tcBorders>
           </w:tcPr>
           <w:p>
             <w:pPr>
@@ -291,12 +279,6 @@
         </w:tc>
         <w:tc>
           <w:tcPr>
-            <w:tcBorders>
-              <w:top w:val="single" w:sz="4" w:space="0" w:color="000000"/>
-              <w:left w:val="single" w:sz="4" w:space="0" w:color="000000"/>
-              <w:bottom w:val="single" w:sz="4" w:space="0" w:color="000000"/>
-              <w:right w:val="single" w:sz="4" w:space="0" w:color="000000"/>
-            </w:tcBorders>
             <w:tcBorders>
               <w:top w:val="single" w:sz="4" w:space="0" w:color="000000"/>
               <w:left w:val="single" w:sz="4" w:space="0" w:color="000000"/>
@@ -317,12 +299,6 @@
       <w:tr>
         <w:tc>
           <w:tcPr>
-            <w:tcBorders>
-              <w:top w:val="single" w:sz="4" w:space="0" w:color="000000"/>
-              <w:left w:val="single" w:sz="4" w:space="0" w:color="000000"/>
-              <w:bottom w:val="single" w:sz="4" w:space="0" w:color="000000"/>
-              <w:right w:val="single" w:sz="4" w:space="0" w:color="000000"/>
-            </w:tcBorders>
             <w:tcBorders>
               <w:top w:val="single" w:sz="4" w:space="0" w:color="000000"/>
               <w:left w:val="single" w:sz="4" w:space="0" w:color="000000"/>
@@ -357,12 +333,6 @@
               <w:bottom w:val="single" w:sz="4" w:space="0" w:color="000000"/>
               <w:right w:val="single" w:sz="4" w:space="0" w:color="000000"/>
             </w:tcBorders>
-            <w:tcBorders>
-              <w:top w:val="single" w:sz="4" w:space="0" w:color="000000"/>
-              <w:left w:val="single" w:sz="4" w:space="0" w:color="000000"/>
-              <w:bottom w:val="single" w:sz="4" w:space="0" w:color="000000"/>
-              <w:right w:val="single" w:sz="4" w:space="0" w:color="000000"/>
-            </w:tcBorders>
           </w:tcPr>
           <w:p>
             <w:pPr>
@@ -375,12 +345,6 @@
         </w:tc>
         <w:tc>
           <w:tcPr>
-            <w:tcBorders>
-              <w:top w:val="single" w:sz="4" w:space="0" w:color="000000"/>
-              <w:left w:val="single" w:sz="4" w:space="0" w:color="000000"/>
-              <w:bottom w:val="single" w:sz="4" w:space="0" w:color="000000"/>
-              <w:right w:val="single" w:sz="4" w:space="0" w:color="000000"/>
-            </w:tcBorders>
             <w:tcBorders>
               <w:top w:val="single" w:sz="4" w:space="0" w:color="000000"/>
               <w:left w:val="single" w:sz="4" w:space="0" w:color="000000"/>
@@ -398,12 +362,6 @@
       <w:tr>
         <w:tc>
           <w:tcPr>
-            <w:tcBorders>
-              <w:top w:val="single" w:sz="4" w:space="0" w:color="000000"/>
-              <w:left w:val="single" w:sz="4" w:space="0" w:color="000000"/>
-              <w:bottom w:val="single" w:sz="4" w:space="0" w:color="000000"/>
-              <w:right w:val="single" w:sz="4" w:space="0" w:color="000000"/>
-            </w:tcBorders>
             <w:tcBorders>
               <w:top w:val="single" w:sz="4" w:space="0" w:color="000000"/>
               <w:left w:val="single" w:sz="4" w:space="0" w:color="000000"/>
@@ -438,12 +396,6 @@
               <w:bottom w:val="single" w:sz="4" w:space="0" w:color="000000"/>
               <w:right w:val="single" w:sz="4" w:space="0" w:color="000000"/>
             </w:tcBorders>
-            <w:tcBorders>
-              <w:top w:val="single" w:sz="4" w:space="0" w:color="000000"/>
-              <w:left w:val="single" w:sz="4" w:space="0" w:color="000000"/>
-              <w:bottom w:val="single" w:sz="4" w:space="0" w:color="000000"/>
-              <w:right w:val="single" w:sz="4" w:space="0" w:color="000000"/>
-            </w:tcBorders>
           </w:tcPr>
           <w:p>
             <w:pPr>
@@ -456,12 +408,6 @@
         </w:tc>
         <w:tc>
           <w:tcPr>
-            <w:tcBorders>
-              <w:top w:val="single" w:sz="4" w:space="0" w:color="000000"/>
-              <w:left w:val="single" w:sz="4" w:space="0" w:color="000000"/>
-              <w:bottom w:val="single" w:sz="4" w:space="0" w:color="000000"/>
-              <w:right w:val="single" w:sz="4" w:space="0" w:color="000000"/>
-            </w:tcBorders>
             <w:tcBorders>
               <w:top w:val="single" w:sz="4" w:space="0" w:color="000000"/>
               <w:left w:val="single" w:sz="4" w:space="0" w:color="000000"/>
@@ -479,12 +425,6 @@
       <w:tr>
         <w:tc>
           <w:tcPr>
-            <w:tcBorders>
-              <w:top w:val="single" w:sz="4" w:space="0" w:color="000000"/>
-              <w:left w:val="single" w:sz="4" w:space="0" w:color="000000"/>
-              <w:bottom w:val="single" w:sz="4" w:space="0" w:color="000000"/>
-              <w:right w:val="single" w:sz="4" w:space="0" w:color="000000"/>
-            </w:tcBorders>
             <w:tcBorders>
               <w:top w:val="single" w:sz="4" w:space="0" w:color="000000"/>
               <w:left w:val="single" w:sz="4" w:space="0" w:color="000000"/>
@@ -519,12 +459,6 @@
               <w:bottom w:val="single" w:sz="4" w:space="0" w:color="000000"/>
               <w:right w:val="single" w:sz="4" w:space="0" w:color="000000"/>
             </w:tcBorders>
-            <w:tcBorders>
-              <w:top w:val="single" w:sz="4" w:space="0" w:color="000000"/>
-              <w:left w:val="single" w:sz="4" w:space="0" w:color="000000"/>
-              <w:bottom w:val="single" w:sz="4" w:space="0" w:color="000000"/>
-              <w:right w:val="single" w:sz="4" w:space="0" w:color="000000"/>
-            </w:tcBorders>
           </w:tcPr>
           <w:p>
             <w:pPr>
@@ -537,12 +471,6 @@
         </w:tc>
         <w:tc>
           <w:tcPr>
-            <w:tcBorders>
-              <w:top w:val="single" w:sz="4" w:space="0" w:color="000000"/>
-              <w:left w:val="single" w:sz="4" w:space="0" w:color="000000"/>
-              <w:bottom w:val="single" w:sz="4" w:space="0" w:color="000000"/>
-              <w:right w:val="single" w:sz="4" w:space="0" w:color="000000"/>
-            </w:tcBorders>
             <w:tcBorders>
               <w:top w:val="single" w:sz="4" w:space="0" w:color="000000"/>
               <w:left w:val="single" w:sz="4" w:space="0" w:color="000000"/>
@@ -560,12 +488,6 @@
       <w:tr>
         <w:tc>
           <w:tcPr>
-            <w:tcBorders>
-              <w:top w:val="single" w:sz="4" w:space="0" w:color="000000"/>
-              <w:left w:val="single" w:sz="4" w:space="0" w:color="000000"/>
-              <w:bottom w:val="single" w:sz="4" w:space="0" w:color="000000"/>
-              <w:right w:val="single" w:sz="4" w:space="0" w:color="000000"/>
-            </w:tcBorders>
             <w:tcBorders>
               <w:top w:val="single" w:sz="4" w:space="0" w:color="000000"/>
               <w:left w:val="single" w:sz="4" w:space="0" w:color="000000"/>
@@ -600,12 +522,6 @@
               <w:bottom w:val="single" w:sz="4" w:space="0" w:color="000000"/>
               <w:right w:val="single" w:sz="4" w:space="0" w:color="000000"/>
             </w:tcBorders>
-            <w:tcBorders>
-              <w:top w:val="single" w:sz="4" w:space="0" w:color="000000"/>
-              <w:left w:val="single" w:sz="4" w:space="0" w:color="000000"/>
-              <w:bottom w:val="single" w:sz="4" w:space="0" w:color="000000"/>
-              <w:right w:val="single" w:sz="4" w:space="0" w:color="000000"/>
-            </w:tcBorders>
           </w:tcPr>
           <w:p>
             <w:pPr>
@@ -618,12 +534,6 @@
         </w:tc>
         <w:tc>
           <w:tcPr>
-            <w:tcBorders>
-              <w:top w:val="single" w:sz="4" w:space="0" w:color="000000"/>
-              <w:left w:val="single" w:sz="4" w:space="0" w:color="000000"/>
-              <w:bottom w:val="single" w:sz="4" w:space="0" w:color="000000"/>
-              <w:right w:val="single" w:sz="4" w:space="0" w:color="000000"/>
-            </w:tcBorders>
             <w:tcBorders>
               <w:top w:val="single" w:sz="4" w:space="0" w:color="000000"/>
               <w:left w:val="single" w:sz="4" w:space="0" w:color="000000"/>
@@ -641,12 +551,6 @@
       <w:tr>
         <w:tc>
           <w:tcPr>
-            <w:tcBorders>
-              <w:top w:val="single" w:sz="4" w:space="0" w:color="000000"/>
-              <w:left w:val="single" w:sz="4" w:space="0" w:color="000000"/>
-              <w:bottom w:val="single" w:sz="4" w:space="0" w:color="000000"/>
-              <w:right w:val="single" w:sz="4" w:space="0" w:color="000000"/>
-            </w:tcBorders>
             <w:tcBorders>
               <w:top w:val="single" w:sz="4" w:space="0" w:color="000000"/>
               <w:left w:val="single" w:sz="4" w:space="0" w:color="000000"/>
@@ -681,12 +585,6 @@
               <w:bottom w:val="single" w:sz="4" w:space="0" w:color="000000"/>
               <w:right w:val="single" w:sz="4" w:space="0" w:color="000000"/>
             </w:tcBorders>
-            <w:tcBorders>
-              <w:top w:val="single" w:sz="4" w:space="0" w:color="000000"/>
-              <w:left w:val="single" w:sz="4" w:space="0" w:color="000000"/>
-              <w:bottom w:val="single" w:sz="4" w:space="0" w:color="000000"/>
-              <w:right w:val="single" w:sz="4" w:space="0" w:color="000000"/>
-            </w:tcBorders>
           </w:tcPr>
           <w:p>
             <w:pPr>
@@ -699,12 +597,6 @@
         </w:tc>
         <w:tc>
           <w:tcPr>
-            <w:tcBorders>
-              <w:top w:val="single" w:sz="4" w:space="0" w:color="000000"/>
-              <w:left w:val="single" w:sz="4" w:space="0" w:color="000000"/>
-              <w:bottom w:val="single" w:sz="4" w:space="0" w:color="000000"/>
-              <w:right w:val="single" w:sz="4" w:space="0" w:color="000000"/>
-            </w:tcBorders>
             <w:tcBorders>
               <w:top w:val="single" w:sz="4" w:space="0" w:color="000000"/>
               <w:left w:val="single" w:sz="4" w:space="0" w:color="000000"/>
@@ -796,12 +688,6 @@
               <w:bottom w:val="single" w:sz="4" w:space="0" w:color="000000"/>
               <w:right w:val="single" w:sz="4" w:space="0" w:color="000000"/>
             </w:tcBorders>
-            <w:tcBorders>
-              <w:top w:val="single" w:sz="4" w:space="0" w:color="000000"/>
-              <w:left w:val="single" w:sz="4" w:space="0" w:color="000000"/>
-              <w:bottom w:val="single" w:sz="4" w:space="0" w:color="000000"/>
-              <w:right w:val="single" w:sz="4" w:space="0" w:color="000000"/>
-            </w:tcBorders>
           </w:tcPr>
           <w:p>
             <w:pPr>
@@ -820,12 +706,6 @@
               <w:bottom w:val="single" w:sz="4" w:space="0" w:color="000000"/>
               <w:right w:val="single" w:sz="4" w:space="0" w:color="000000"/>
             </w:tcBorders>
-            <w:tcBorders>
-              <w:top w:val="single" w:sz="4" w:space="0" w:color="000000"/>
-              <w:left w:val="single" w:sz="4" w:space="0" w:color="000000"/>
-              <w:bottom w:val="single" w:sz="4" w:space="0" w:color="000000"/>
-              <w:right w:val="single" w:sz="4" w:space="0" w:color="000000"/>
-            </w:tcBorders>
           </w:tcPr>
           <w:p>
             <w:pPr>
@@ -838,12 +718,6 @@
         </w:tc>
         <w:tc>
           <w:tcPr>
-            <w:tcBorders>
-              <w:top w:val="single" w:sz="4" w:space="0" w:color="000000"/>
-              <w:left w:val="single" w:sz="4" w:space="0" w:color="000000"/>
-              <w:bottom w:val="single" w:sz="4" w:space="0" w:color="000000"/>
-              <w:right w:val="single" w:sz="4" w:space="0" w:color="000000"/>
-            </w:tcBorders>
             <w:tcBorders>
               <w:top w:val="single" w:sz="4" w:space="0" w:color="000000"/>
               <w:left w:val="single" w:sz="4" w:space="0" w:color="000000"/>
@@ -864,12 +738,6 @@
       <w:tr>
         <w:tc>
           <w:tcPr>
-            <w:tcBorders>
-              <w:top w:val="single" w:sz="4" w:space="0" w:color="000000"/>
-              <w:left w:val="single" w:sz="4" w:space="0" w:color="000000"/>
-              <w:bottom w:val="single" w:sz="4" w:space="0" w:color="000000"/>
-              <w:right w:val="single" w:sz="4" w:space="0" w:color="000000"/>
-            </w:tcBorders>
             <w:tcBorders>
               <w:top w:val="single" w:sz="4" w:space="0" w:color="000000"/>
               <w:left w:val="single" w:sz="4" w:space="0" w:color="000000"/>
@@ -898,12 +766,6 @@
               <w:bottom w:val="single" w:sz="4" w:space="0" w:color="000000"/>
               <w:right w:val="single" w:sz="4" w:space="0" w:color="000000"/>
             </w:tcBorders>
-            <w:tcBorders>
-              <w:top w:val="single" w:sz="4" w:space="0" w:color="000000"/>
-              <w:left w:val="single" w:sz="4" w:space="0" w:color="000000"/>
-              <w:bottom w:val="single" w:sz="4" w:space="0" w:color="000000"/>
-              <w:right w:val="single" w:sz="4" w:space="0" w:color="000000"/>
-            </w:tcBorders>
           </w:tcPr>
           <w:p>
             <w:pPr>
@@ -916,12 +778,6 @@
         </w:tc>
         <w:tc>
           <w:tcPr>
-            <w:tcBorders>
-              <w:top w:val="single" w:sz="4" w:space="0" w:color="000000"/>
-              <w:left w:val="single" w:sz="4" w:space="0" w:color="000000"/>
-              <w:bottom w:val="single" w:sz="4" w:space="0" w:color="000000"/>
-              <w:right w:val="single" w:sz="4" w:space="0" w:color="000000"/>
-            </w:tcBorders>
             <w:tcBorders>
               <w:top w:val="single" w:sz="4" w:space="0" w:color="000000"/>
               <w:left w:val="single" w:sz="4" w:space="0" w:color="000000"/>
@@ -939,12 +795,6 @@
       <w:tr>
         <w:tc>
           <w:tcPr>
-            <w:tcBorders>
-              <w:top w:val="single" w:sz="4" w:space="0" w:color="000000"/>
-              <w:left w:val="single" w:sz="4" w:space="0" w:color="000000"/>
-              <w:bottom w:val="single" w:sz="4" w:space="0" w:color="000000"/>
-              <w:right w:val="single" w:sz="4" w:space="0" w:color="000000"/>
-            </w:tcBorders>
             <w:tcBorders>
               <w:top w:val="single" w:sz="4" w:space="0" w:color="000000"/>
               <w:left w:val="single" w:sz="4" w:space="0" w:color="000000"/>
@@ -973,12 +823,6 @@
               <w:bottom w:val="single" w:sz="4" w:space="0" w:color="000000"/>
               <w:right w:val="single" w:sz="4" w:space="0" w:color="000000"/>
             </w:tcBorders>
-            <w:tcBorders>
-              <w:top w:val="single" w:sz="4" w:space="0" w:color="000000"/>
-              <w:left w:val="single" w:sz="4" w:space="0" w:color="000000"/>
-              <w:bottom w:val="single" w:sz="4" w:space="0" w:color="000000"/>
-              <w:right w:val="single" w:sz="4" w:space="0" w:color="000000"/>
-            </w:tcBorders>
           </w:tcPr>
           <w:p>
             <w:pPr>
@@ -991,12 +835,6 @@
         </w:tc>
         <w:tc>
           <w:tcPr>
-            <w:tcBorders>
-              <w:top w:val="single" w:sz="4" w:space="0" w:color="000000"/>
-              <w:left w:val="single" w:sz="4" w:space="0" w:color="000000"/>
-              <w:bottom w:val="single" w:sz="4" w:space="0" w:color="000000"/>
-              <w:right w:val="single" w:sz="4" w:space="0" w:color="000000"/>
-            </w:tcBorders>
             <w:tcBorders>
               <w:top w:val="single" w:sz="4" w:space="0" w:color="000000"/>
               <w:left w:val="single" w:sz="4" w:space="0" w:color="000000"/>
@@ -1014,12 +852,6 @@
       <w:tr>
         <w:tc>
           <w:tcPr>
-            <w:tcBorders>
-              <w:top w:val="single" w:sz="4" w:space="0" w:color="000000"/>
-              <w:left w:val="single" w:sz="4" w:space="0" w:color="000000"/>
-              <w:bottom w:val="single" w:sz="4" w:space="0" w:color="000000"/>
-              <w:right w:val="single" w:sz="4" w:space="0" w:color="000000"/>
-            </w:tcBorders>
             <w:tcBorders>
               <w:top w:val="single" w:sz="4" w:space="0" w:color="000000"/>
               <w:left w:val="single" w:sz="4" w:space="0" w:color="000000"/>
@@ -1048,12 +880,6 @@
               <w:bottom w:val="single" w:sz="4" w:space="0" w:color="000000"/>
               <w:right w:val="single" w:sz="4" w:space="0" w:color="000000"/>
             </w:tcBorders>
-            <w:tcBorders>
-              <w:top w:val="single" w:sz="4" w:space="0" w:color="000000"/>
-              <w:left w:val="single" w:sz="4" w:space="0" w:color="000000"/>
-              <w:bottom w:val="single" w:sz="4" w:space="0" w:color="000000"/>
-              <w:right w:val="single" w:sz="4" w:space="0" w:color="000000"/>
-            </w:tcBorders>
           </w:tcPr>
           <w:p>
             <w:pPr>
@@ -1066,12 +892,6 @@
         </w:tc>
         <w:tc>
           <w:tcPr>
-            <w:tcBorders>
-              <w:top w:val="single" w:sz="4" w:space="0" w:color="000000"/>
-              <w:left w:val="single" w:sz="4" w:space="0" w:color="000000"/>
-              <w:bottom w:val="single" w:sz="4" w:space="0" w:color="000000"/>
-              <w:right w:val="single" w:sz="4" w:space="0" w:color="000000"/>
-            </w:tcBorders>
             <w:tcBorders>
               <w:top w:val="single" w:sz="4" w:space="0" w:color="000000"/>
               <w:left w:val="single" w:sz="4" w:space="0" w:color="000000"/>
@@ -1089,12 +909,6 @@
       <w:tr>
         <w:tc>
           <w:tcPr>
-            <w:tcBorders>
-              <w:top w:val="single" w:sz="4" w:space="0" w:color="000000"/>
-              <w:left w:val="single" w:sz="4" w:space="0" w:color="000000"/>
-              <w:bottom w:val="single" w:sz="4" w:space="0" w:color="000000"/>
-              <w:right w:val="single" w:sz="4" w:space="0" w:color="000000"/>
-            </w:tcBorders>
             <w:tcBorders>
               <w:top w:val="single" w:sz="4" w:space="0" w:color="000000"/>
               <w:left w:val="single" w:sz="4" w:space="0" w:color="000000"/>
@@ -1123,12 +937,6 @@
               <w:bottom w:val="single" w:sz="4" w:space="0" w:color="000000"/>
               <w:right w:val="single" w:sz="4" w:space="0" w:color="000000"/>
             </w:tcBorders>
-            <w:tcBorders>
-              <w:top w:val="single" w:sz="4" w:space="0" w:color="000000"/>
-              <w:left w:val="single" w:sz="4" w:space="0" w:color="000000"/>
-              <w:bottom w:val="single" w:sz="4" w:space="0" w:color="000000"/>
-              <w:right w:val="single" w:sz="4" w:space="0" w:color="000000"/>
-            </w:tcBorders>
           </w:tcPr>
           <w:p>
             <w:pPr>
@@ -1141,12 +949,6 @@
         </w:tc>
         <w:tc>
           <w:tcPr>
-            <w:tcBorders>
-              <w:top w:val="single" w:sz="4" w:space="0" w:color="000000"/>
-              <w:left w:val="single" w:sz="4" w:space="0" w:color="000000"/>
-              <w:bottom w:val="single" w:sz="4" w:space="0" w:color="000000"/>
-              <w:right w:val="single" w:sz="4" w:space="0" w:color="000000"/>
-            </w:tcBorders>
             <w:tcBorders>
               <w:top w:val="single" w:sz="4" w:space="0" w:color="000000"/>
               <w:left w:val="single" w:sz="4" w:space="0" w:color="000000"/>
@@ -1164,12 +966,6 @@
       <w:tr>
         <w:tc>
           <w:tcPr>
-            <w:tcBorders>
-              <w:top w:val="single" w:sz="4" w:space="0" w:color="000000"/>
-              <w:left w:val="single" w:sz="4" w:space="0" w:color="000000"/>
-              <w:bottom w:val="single" w:sz="4" w:space="0" w:color="000000"/>
-              <w:right w:val="single" w:sz="4" w:space="0" w:color="000000"/>
-            </w:tcBorders>
             <w:tcBorders>
               <w:top w:val="single" w:sz="4" w:space="0" w:color="000000"/>
               <w:left w:val="single" w:sz="4" w:space="0" w:color="000000"/>
@@ -1198,12 +994,6 @@
               <w:bottom w:val="single" w:sz="4" w:space="0" w:color="000000"/>
               <w:right w:val="single" w:sz="4" w:space="0" w:color="000000"/>
             </w:tcBorders>
-            <w:tcBorders>
-              <w:top w:val="single" w:sz="4" w:space="0" w:color="000000"/>
-              <w:left w:val="single" w:sz="4" w:space="0" w:color="000000"/>
-              <w:bottom w:val="single" w:sz="4" w:space="0" w:color="000000"/>
-              <w:right w:val="single" w:sz="4" w:space="0" w:color="000000"/>
-            </w:tcBorders>
           </w:tcPr>
           <w:p>
             <w:pPr>
@@ -1216,12 +1006,6 @@
         </w:tc>
         <w:tc>
           <w:tcPr>
-            <w:tcBorders>
-              <w:top w:val="single" w:sz="4" w:space="0" w:color="000000"/>
-              <w:left w:val="single" w:sz="4" w:space="0" w:color="000000"/>
-              <w:bottom w:val="single" w:sz="4" w:space="0" w:color="000000"/>
-              <w:right w:val="single" w:sz="4" w:space="0" w:color="000000"/>
-            </w:tcBorders>
             <w:tcBorders>
               <w:top w:val="single" w:sz="4" w:space="0" w:color="000000"/>
               <w:left w:val="single" w:sz="4" w:space="0" w:color="000000"/>
@@ -1315,12 +1099,6 @@
               <w:bottom w:val="single" w:sz="4" w:space="0" w:color="000000"/>
               <w:right w:val="single" w:sz="4" w:space="0" w:color="000000"/>
             </w:tcBorders>
-            <w:tcBorders>
-              <w:top w:val="single" w:sz="4" w:space="0" w:color="000000"/>
-              <w:left w:val="single" w:sz="4" w:space="0" w:color="000000"/>
-              <w:bottom w:val="single" w:sz="4" w:space="0" w:color="000000"/>
-              <w:right w:val="single" w:sz="4" w:space="0" w:color="000000"/>
-            </w:tcBorders>
           </w:tcPr>
           <w:p>
             <w:pPr>
@@ -1339,12 +1117,6 @@
               <w:bottom w:val="single" w:sz="4" w:space="0" w:color="000000"/>
               <w:right w:val="single" w:sz="4" w:space="0" w:color="000000"/>
             </w:tcBorders>
-            <w:tcBorders>
-              <w:top w:val="single" w:sz="4" w:space="0" w:color="000000"/>
-              <w:left w:val="single" w:sz="4" w:space="0" w:color="000000"/>
-              <w:bottom w:val="single" w:sz="4" w:space="0" w:color="000000"/>
-              <w:right w:val="single" w:sz="4" w:space="0" w:color="000000"/>
-            </w:tcBorders>
           </w:tcPr>
           <w:p>
             <w:pPr>
@@ -1363,12 +1135,6 @@
               <w:bottom w:val="single" w:sz="4" w:space="0" w:color="000000"/>
               <w:right w:val="single" w:sz="4" w:space="0" w:color="000000"/>
             </w:tcBorders>
-            <w:tcBorders>
-              <w:top w:val="single" w:sz="4" w:space="0" w:color="000000"/>
-              <w:left w:val="single" w:sz="4" w:space="0" w:color="000000"/>
-              <w:bottom w:val="single" w:sz="4" w:space="0" w:color="000000"/>
-              <w:right w:val="single" w:sz="4" w:space="0" w:color="000000"/>
-            </w:tcBorders>
           </w:tcPr>
           <w:p>
             <w:pPr>
@@ -1387,12 +1153,6 @@
               <w:bottom w:val="single" w:sz="4" w:space="0" w:color="000000"/>
               <w:right w:val="single" w:sz="4" w:space="0" w:color="000000"/>
             </w:tcBorders>
-            <w:tcBorders>
-              <w:top w:val="single" w:sz="4" w:space="0" w:color="000000"/>
-              <w:left w:val="single" w:sz="4" w:space="0" w:color="000000"/>
-              <w:bottom w:val="single" w:sz="4" w:space="0" w:color="000000"/>
-              <w:right w:val="single" w:sz="4" w:space="0" w:color="000000"/>
-            </w:tcBorders>
           </w:tcPr>
           <w:p>
             <w:pPr>
@@ -1411,12 +1171,6 @@
               <w:bottom w:val="single" w:sz="4" w:space="0" w:color="000000"/>
               <w:right w:val="single" w:sz="4" w:space="0" w:color="000000"/>
             </w:tcBorders>
-            <w:tcBorders>
-              <w:top w:val="single" w:sz="4" w:space="0" w:color="000000"/>
-              <w:left w:val="single" w:sz="4" w:space="0" w:color="000000"/>
-              <w:bottom w:val="single" w:sz="4" w:space="0" w:color="000000"/>
-              <w:right w:val="single" w:sz="4" w:space="0" w:color="000000"/>
-            </w:tcBorders>
           </w:tcPr>
           <w:p>
             <w:pPr>
@@ -1429,12 +1183,6 @@
         </w:tc>
         <w:tc>
           <w:tcPr>
-            <w:tcBorders>
-              <w:top w:val="single" w:sz="4" w:space="0" w:color="000000"/>
-              <w:left w:val="single" w:sz="4" w:space="0" w:color="000000"/>
-              <w:bottom w:val="single" w:sz="4" w:space="0" w:color="000000"/>
-              <w:right w:val="single" w:sz="4" w:space="0" w:color="000000"/>
-            </w:tcBorders>
             <w:tcBorders>
               <w:top w:val="single" w:sz="4" w:space="0" w:color="000000"/>
               <w:left w:val="single" w:sz="4" w:space="0" w:color="000000"/>
@@ -1461,12 +1209,6 @@
               <w:bottom w:val="single" w:sz="4" w:space="0" w:color="000000"/>
               <w:right w:val="single" w:sz="4" w:space="0" w:color="000000"/>
             </w:tcBorders>
-            <w:tcBorders>
-              <w:top w:val="single" w:sz="4" w:space="0" w:color="000000"/>
-              <w:left w:val="single" w:sz="4" w:space="0" w:color="000000"/>
-              <w:bottom w:val="single" w:sz="4" w:space="0" w:color="000000"/>
-              <w:right w:val="single" w:sz="4" w:space="0" w:color="000000"/>
-            </w:tcBorders>
           </w:tcPr>
           <w:p>
             <w:pPr>
@@ -1485,90 +1227,60 @@
               <w:bottom w:val="single" w:sz="4" w:space="0" w:color="000000"/>
               <w:right w:val="single" w:sz="4" w:space="0" w:color="000000"/>
             </w:tcBorders>
-            <w:tcBorders>
-              <w:top w:val="single" w:sz="4" w:space="0" w:color="000000"/>
-              <w:left w:val="single" w:sz="4" w:space="0" w:color="000000"/>
-              <w:bottom w:val="single" w:sz="4" w:space="0" w:color="000000"/>
-              <w:right w:val="single" w:sz="4" w:space="0" w:color="000000"/>
-            </w:tcBorders>
-          </w:tcPr>
-          <w:p>
-            <w:pPr>
-              <w:pStyle w:val="Compact"/>
-            </w:pPr>
-          </w:p>
-        </w:tc>
-        <w:tc>
-          <w:tcPr>
-            <w:tcBorders>
-              <w:top w:val="single" w:sz="4" w:space="0" w:color="000000"/>
-              <w:left w:val="single" w:sz="4" w:space="0" w:color="000000"/>
-              <w:bottom w:val="single" w:sz="4" w:space="0" w:color="000000"/>
-              <w:right w:val="single" w:sz="4" w:space="0" w:color="000000"/>
-            </w:tcBorders>
-            <w:tcBorders>
-              <w:top w:val="single" w:sz="4" w:space="0" w:color="000000"/>
-              <w:left w:val="single" w:sz="4" w:space="0" w:color="000000"/>
-              <w:bottom w:val="single" w:sz="4" w:space="0" w:color="000000"/>
-              <w:right w:val="single" w:sz="4" w:space="0" w:color="000000"/>
-            </w:tcBorders>
-          </w:tcPr>
-          <w:p>
-            <w:pPr>
-              <w:pStyle w:val="Compact"/>
-            </w:pPr>
-          </w:p>
-        </w:tc>
-        <w:tc>
-          <w:tcPr>
-            <w:tcBorders>
-              <w:top w:val="single" w:sz="4" w:space="0" w:color="000000"/>
-              <w:left w:val="single" w:sz="4" w:space="0" w:color="000000"/>
-              <w:bottom w:val="single" w:sz="4" w:space="0" w:color="000000"/>
-              <w:right w:val="single" w:sz="4" w:space="0" w:color="000000"/>
-            </w:tcBorders>
-            <w:tcBorders>
-              <w:top w:val="single" w:sz="4" w:space="0" w:color="000000"/>
-              <w:left w:val="single" w:sz="4" w:space="0" w:color="000000"/>
-              <w:bottom w:val="single" w:sz="4" w:space="0" w:color="000000"/>
-              <w:right w:val="single" w:sz="4" w:space="0" w:color="000000"/>
-            </w:tcBorders>
-          </w:tcPr>
-          <w:p>
-            <w:pPr>
-              <w:pStyle w:val="Compact"/>
-            </w:pPr>
-          </w:p>
-        </w:tc>
-        <w:tc>
-          <w:tcPr>
-            <w:tcBorders>
-              <w:top w:val="single" w:sz="4" w:space="0" w:color="000000"/>
-              <w:left w:val="single" w:sz="4" w:space="0" w:color="000000"/>
-              <w:bottom w:val="single" w:sz="4" w:space="0" w:color="000000"/>
-              <w:right w:val="single" w:sz="4" w:space="0" w:color="000000"/>
-            </w:tcBorders>
-            <w:tcBorders>
-              <w:top w:val="single" w:sz="4" w:space="0" w:color="000000"/>
-              <w:left w:val="single" w:sz="4" w:space="0" w:color="000000"/>
-              <w:bottom w:val="single" w:sz="4" w:space="0" w:color="000000"/>
-              <w:right w:val="single" w:sz="4" w:space="0" w:color="000000"/>
-            </w:tcBorders>
-          </w:tcPr>
-          <w:p>
-            <w:pPr>
-              <w:pStyle w:val="Compact"/>
-            </w:pPr>
-          </w:p>
-        </w:tc>
-        <w:tc>
-          <w:tcPr>
-            <w:tcBorders>
-              <w:top w:val="single" w:sz="4" w:space="0" w:color="000000"/>
-              <w:left w:val="single" w:sz="4" w:space="0" w:color="000000"/>
-              <w:bottom w:val="single" w:sz="4" w:space="0" w:color="000000"/>
-              <w:right w:val="single" w:sz="4" w:space="0" w:color="000000"/>
-            </w:tcBorders>
+          </w:tcPr>
+          <w:p>
+            <w:pPr>
+              <w:pStyle w:val="Compact"/>
+            </w:pPr>
+          </w:p>
+        </w:tc>
+        <w:tc>
+          <w:tcPr>
+            <w:tcBorders>
+              <w:top w:val="single" w:sz="4" w:space="0" w:color="000000"/>
+              <w:left w:val="single" w:sz="4" w:space="0" w:color="000000"/>
+              <w:bottom w:val="single" w:sz="4" w:space="0" w:color="000000"/>
+              <w:right w:val="single" w:sz="4" w:space="0" w:color="000000"/>
+            </w:tcBorders>
+          </w:tcPr>
+          <w:p>
+            <w:pPr>
+              <w:pStyle w:val="Compact"/>
+            </w:pPr>
+          </w:p>
+        </w:tc>
+        <w:tc>
+          <w:tcPr>
+            <w:tcBorders>
+              <w:top w:val="single" w:sz="4" w:space="0" w:color="000000"/>
+              <w:left w:val="single" w:sz="4" w:space="0" w:color="000000"/>
+              <w:bottom w:val="single" w:sz="4" w:space="0" w:color="000000"/>
+              <w:right w:val="single" w:sz="4" w:space="0" w:color="000000"/>
+            </w:tcBorders>
+          </w:tcPr>
+          <w:p>
+            <w:pPr>
+              <w:pStyle w:val="Compact"/>
+            </w:pPr>
+          </w:p>
+        </w:tc>
+        <w:tc>
+          <w:tcPr>
+            <w:tcBorders>
+              <w:top w:val="single" w:sz="4" w:space="0" w:color="000000"/>
+              <w:left w:val="single" w:sz="4" w:space="0" w:color="000000"/>
+              <w:bottom w:val="single" w:sz="4" w:space="0" w:color="000000"/>
+              <w:right w:val="single" w:sz="4" w:space="0" w:color="000000"/>
+            </w:tcBorders>
+          </w:tcPr>
+          <w:p>
+            <w:pPr>
+              <w:pStyle w:val="Compact"/>
+            </w:pPr>
+          </w:p>
+        </w:tc>
+        <w:tc>
+          <w:tcPr>
             <w:tcBorders>
               <w:top w:val="single" w:sz="4" w:space="0" w:color="000000"/>
               <w:left w:val="single" w:sz="4" w:space="0" w:color="000000"/>
@@ -1592,12 +1304,6 @@
               <w:bottom w:val="single" w:sz="4" w:space="0" w:color="000000"/>
               <w:right w:val="single" w:sz="4" w:space="0" w:color="000000"/>
             </w:tcBorders>
-            <w:tcBorders>
-              <w:top w:val="single" w:sz="4" w:space="0" w:color="000000"/>
-              <w:left w:val="single" w:sz="4" w:space="0" w:color="000000"/>
-              <w:bottom w:val="single" w:sz="4" w:space="0" w:color="000000"/>
-              <w:right w:val="single" w:sz="4" w:space="0" w:color="000000"/>
-            </w:tcBorders>
           </w:tcPr>
           <w:p>
             <w:pPr>
@@ -1616,90 +1322,60 @@
               <w:bottom w:val="single" w:sz="4" w:space="0" w:color="000000"/>
               <w:right w:val="single" w:sz="4" w:space="0" w:color="000000"/>
             </w:tcBorders>
-            <w:tcBorders>
-              <w:top w:val="single" w:sz="4" w:space="0" w:color="000000"/>
-              <w:left w:val="single" w:sz="4" w:space="0" w:color="000000"/>
-              <w:bottom w:val="single" w:sz="4" w:space="0" w:color="000000"/>
-              <w:right w:val="single" w:sz="4" w:space="0" w:color="000000"/>
-            </w:tcBorders>
-          </w:tcPr>
-          <w:p>
-            <w:pPr>
-              <w:pStyle w:val="Compact"/>
-            </w:pPr>
-          </w:p>
-        </w:tc>
-        <w:tc>
-          <w:tcPr>
-            <w:tcBorders>
-              <w:top w:val="single" w:sz="4" w:space="0" w:color="000000"/>
-              <w:left w:val="single" w:sz="4" w:space="0" w:color="000000"/>
-              <w:bottom w:val="single" w:sz="4" w:space="0" w:color="000000"/>
-              <w:right w:val="single" w:sz="4" w:space="0" w:color="000000"/>
-            </w:tcBorders>
-            <w:tcBorders>
-              <w:top w:val="single" w:sz="4" w:space="0" w:color="000000"/>
-              <w:left w:val="single" w:sz="4" w:space="0" w:color="000000"/>
-              <w:bottom w:val="single" w:sz="4" w:space="0" w:color="000000"/>
-              <w:right w:val="single" w:sz="4" w:space="0" w:color="000000"/>
-            </w:tcBorders>
-          </w:tcPr>
-          <w:p>
-            <w:pPr>
-              <w:pStyle w:val="Compact"/>
-            </w:pPr>
-          </w:p>
-        </w:tc>
-        <w:tc>
-          <w:tcPr>
-            <w:tcBorders>
-              <w:top w:val="single" w:sz="4" w:space="0" w:color="000000"/>
-              <w:left w:val="single" w:sz="4" w:space="0" w:color="000000"/>
-              <w:bottom w:val="single" w:sz="4" w:space="0" w:color="000000"/>
-              <w:right w:val="single" w:sz="4" w:space="0" w:color="000000"/>
-            </w:tcBorders>
-            <w:tcBorders>
-              <w:top w:val="single" w:sz="4" w:space="0" w:color="000000"/>
-              <w:left w:val="single" w:sz="4" w:space="0" w:color="000000"/>
-              <w:bottom w:val="single" w:sz="4" w:space="0" w:color="000000"/>
-              <w:right w:val="single" w:sz="4" w:space="0" w:color="000000"/>
-            </w:tcBorders>
-          </w:tcPr>
-          <w:p>
-            <w:pPr>
-              <w:pStyle w:val="Compact"/>
-            </w:pPr>
-          </w:p>
-        </w:tc>
-        <w:tc>
-          <w:tcPr>
-            <w:tcBorders>
-              <w:top w:val="single" w:sz="4" w:space="0" w:color="000000"/>
-              <w:left w:val="single" w:sz="4" w:space="0" w:color="000000"/>
-              <w:bottom w:val="single" w:sz="4" w:space="0" w:color="000000"/>
-              <w:right w:val="single" w:sz="4" w:space="0" w:color="000000"/>
-            </w:tcBorders>
-            <w:tcBorders>
-              <w:top w:val="single" w:sz="4" w:space="0" w:color="000000"/>
-              <w:left w:val="single" w:sz="4" w:space="0" w:color="000000"/>
-              <w:bottom w:val="single" w:sz="4" w:space="0" w:color="000000"/>
-              <w:right w:val="single" w:sz="4" w:space="0" w:color="000000"/>
-            </w:tcBorders>
-          </w:tcPr>
-          <w:p>
-            <w:pPr>
-              <w:pStyle w:val="Compact"/>
-            </w:pPr>
-          </w:p>
-        </w:tc>
-        <w:tc>
-          <w:tcPr>
-            <w:tcBorders>
-              <w:top w:val="single" w:sz="4" w:space="0" w:color="000000"/>
-              <w:left w:val="single" w:sz="4" w:space="0" w:color="000000"/>
-              <w:bottom w:val="single" w:sz="4" w:space="0" w:color="000000"/>
-              <w:right w:val="single" w:sz="4" w:space="0" w:color="000000"/>
-            </w:tcBorders>
+          </w:tcPr>
+          <w:p>
+            <w:pPr>
+              <w:pStyle w:val="Compact"/>
+            </w:pPr>
+          </w:p>
+        </w:tc>
+        <w:tc>
+          <w:tcPr>
+            <w:tcBorders>
+              <w:top w:val="single" w:sz="4" w:space="0" w:color="000000"/>
+              <w:left w:val="single" w:sz="4" w:space="0" w:color="000000"/>
+              <w:bottom w:val="single" w:sz="4" w:space="0" w:color="000000"/>
+              <w:right w:val="single" w:sz="4" w:space="0" w:color="000000"/>
+            </w:tcBorders>
+          </w:tcPr>
+          <w:p>
+            <w:pPr>
+              <w:pStyle w:val="Compact"/>
+            </w:pPr>
+          </w:p>
+        </w:tc>
+        <w:tc>
+          <w:tcPr>
+            <w:tcBorders>
+              <w:top w:val="single" w:sz="4" w:space="0" w:color="000000"/>
+              <w:left w:val="single" w:sz="4" w:space="0" w:color="000000"/>
+              <w:bottom w:val="single" w:sz="4" w:space="0" w:color="000000"/>
+              <w:right w:val="single" w:sz="4" w:space="0" w:color="000000"/>
+            </w:tcBorders>
+          </w:tcPr>
+          <w:p>
+            <w:pPr>
+              <w:pStyle w:val="Compact"/>
+            </w:pPr>
+          </w:p>
+        </w:tc>
+        <w:tc>
+          <w:tcPr>
+            <w:tcBorders>
+              <w:top w:val="single" w:sz="4" w:space="0" w:color="000000"/>
+              <w:left w:val="single" w:sz="4" w:space="0" w:color="000000"/>
+              <w:bottom w:val="single" w:sz="4" w:space="0" w:color="000000"/>
+              <w:right w:val="single" w:sz="4" w:space="0" w:color="000000"/>
+            </w:tcBorders>
+          </w:tcPr>
+          <w:p>
+            <w:pPr>
+              <w:pStyle w:val="Compact"/>
+            </w:pPr>
+          </w:p>
+        </w:tc>
+        <w:tc>
+          <w:tcPr>
             <w:tcBorders>
               <w:top w:val="single" w:sz="4" w:space="0" w:color="000000"/>
               <w:left w:val="single" w:sz="4" w:space="0" w:color="000000"/>
@@ -1723,12 +1399,6 @@
               <w:bottom w:val="single" w:sz="4" w:space="0" w:color="000000"/>
               <w:right w:val="single" w:sz="4" w:space="0" w:color="000000"/>
             </w:tcBorders>
-            <w:tcBorders>
-              <w:top w:val="single" w:sz="4" w:space="0" w:color="000000"/>
-              <w:left w:val="single" w:sz="4" w:space="0" w:color="000000"/>
-              <w:bottom w:val="single" w:sz="4" w:space="0" w:color="000000"/>
-              <w:right w:val="single" w:sz="4" w:space="0" w:color="000000"/>
-            </w:tcBorders>
           </w:tcPr>
           <w:p>
             <w:pPr>
@@ -1747,90 +1417,60 @@
               <w:bottom w:val="single" w:sz="4" w:space="0" w:color="000000"/>
               <w:right w:val="single" w:sz="4" w:space="0" w:color="000000"/>
             </w:tcBorders>
-            <w:tcBorders>
-              <w:top w:val="single" w:sz="4" w:space="0" w:color="000000"/>
-              <w:left w:val="single" w:sz="4" w:space="0" w:color="000000"/>
-              <w:bottom w:val="single" w:sz="4" w:space="0" w:color="000000"/>
-              <w:right w:val="single" w:sz="4" w:space="0" w:color="000000"/>
-            </w:tcBorders>
-          </w:tcPr>
-          <w:p>
-            <w:pPr>
-              <w:pStyle w:val="Compact"/>
-            </w:pPr>
-          </w:p>
-        </w:tc>
-        <w:tc>
-          <w:tcPr>
-            <w:tcBorders>
-              <w:top w:val="single" w:sz="4" w:space="0" w:color="000000"/>
-              <w:left w:val="single" w:sz="4" w:space="0" w:color="000000"/>
-              <w:bottom w:val="single" w:sz="4" w:space="0" w:color="000000"/>
-              <w:right w:val="single" w:sz="4" w:space="0" w:color="000000"/>
-            </w:tcBorders>
-            <w:tcBorders>
-              <w:top w:val="single" w:sz="4" w:space="0" w:color="000000"/>
-              <w:left w:val="single" w:sz="4" w:space="0" w:color="000000"/>
-              <w:bottom w:val="single" w:sz="4" w:space="0" w:color="000000"/>
-              <w:right w:val="single" w:sz="4" w:space="0" w:color="000000"/>
-            </w:tcBorders>
-          </w:tcPr>
-          <w:p>
-            <w:pPr>
-              <w:pStyle w:val="Compact"/>
-            </w:pPr>
-          </w:p>
-        </w:tc>
-        <w:tc>
-          <w:tcPr>
-            <w:tcBorders>
-              <w:top w:val="single" w:sz="4" w:space="0" w:color="000000"/>
-              <w:left w:val="single" w:sz="4" w:space="0" w:color="000000"/>
-              <w:bottom w:val="single" w:sz="4" w:space="0" w:color="000000"/>
-              <w:right w:val="single" w:sz="4" w:space="0" w:color="000000"/>
-            </w:tcBorders>
-            <w:tcBorders>
-              <w:top w:val="single" w:sz="4" w:space="0" w:color="000000"/>
-              <w:left w:val="single" w:sz="4" w:space="0" w:color="000000"/>
-              <w:bottom w:val="single" w:sz="4" w:space="0" w:color="000000"/>
-              <w:right w:val="single" w:sz="4" w:space="0" w:color="000000"/>
-            </w:tcBorders>
-          </w:tcPr>
-          <w:p>
-            <w:pPr>
-              <w:pStyle w:val="Compact"/>
-            </w:pPr>
-          </w:p>
-        </w:tc>
-        <w:tc>
-          <w:tcPr>
-            <w:tcBorders>
-              <w:top w:val="single" w:sz="4" w:space="0" w:color="000000"/>
-              <w:left w:val="single" w:sz="4" w:space="0" w:color="000000"/>
-              <w:bottom w:val="single" w:sz="4" w:space="0" w:color="000000"/>
-              <w:right w:val="single" w:sz="4" w:space="0" w:color="000000"/>
-            </w:tcBorders>
-            <w:tcBorders>
-              <w:top w:val="single" w:sz="4" w:space="0" w:color="000000"/>
-              <w:left w:val="single" w:sz="4" w:space="0" w:color="000000"/>
-              <w:bottom w:val="single" w:sz="4" w:space="0" w:color="000000"/>
-              <w:right w:val="single" w:sz="4" w:space="0" w:color="000000"/>
-            </w:tcBorders>
-          </w:tcPr>
-          <w:p>
-            <w:pPr>
-              <w:pStyle w:val="Compact"/>
-            </w:pPr>
-          </w:p>
-        </w:tc>
-        <w:tc>
-          <w:tcPr>
-            <w:tcBorders>
-              <w:top w:val="single" w:sz="4" w:space="0" w:color="000000"/>
-              <w:left w:val="single" w:sz="4" w:space="0" w:color="000000"/>
-              <w:bottom w:val="single" w:sz="4" w:space="0" w:color="000000"/>
-              <w:right w:val="single" w:sz="4" w:space="0" w:color="000000"/>
-            </w:tcBorders>
+          </w:tcPr>
+          <w:p>
+            <w:pPr>
+              <w:pStyle w:val="Compact"/>
+            </w:pPr>
+          </w:p>
+        </w:tc>
+        <w:tc>
+          <w:tcPr>
+            <w:tcBorders>
+              <w:top w:val="single" w:sz="4" w:space="0" w:color="000000"/>
+              <w:left w:val="single" w:sz="4" w:space="0" w:color="000000"/>
+              <w:bottom w:val="single" w:sz="4" w:space="0" w:color="000000"/>
+              <w:right w:val="single" w:sz="4" w:space="0" w:color="000000"/>
+            </w:tcBorders>
+          </w:tcPr>
+          <w:p>
+            <w:pPr>
+              <w:pStyle w:val="Compact"/>
+            </w:pPr>
+          </w:p>
+        </w:tc>
+        <w:tc>
+          <w:tcPr>
+            <w:tcBorders>
+              <w:top w:val="single" w:sz="4" w:space="0" w:color="000000"/>
+              <w:left w:val="single" w:sz="4" w:space="0" w:color="000000"/>
+              <w:bottom w:val="single" w:sz="4" w:space="0" w:color="000000"/>
+              <w:right w:val="single" w:sz="4" w:space="0" w:color="000000"/>
+            </w:tcBorders>
+          </w:tcPr>
+          <w:p>
+            <w:pPr>
+              <w:pStyle w:val="Compact"/>
+            </w:pPr>
+          </w:p>
+        </w:tc>
+        <w:tc>
+          <w:tcPr>
+            <w:tcBorders>
+              <w:top w:val="single" w:sz="4" w:space="0" w:color="000000"/>
+              <w:left w:val="single" w:sz="4" w:space="0" w:color="000000"/>
+              <w:bottom w:val="single" w:sz="4" w:space="0" w:color="000000"/>
+              <w:right w:val="single" w:sz="4" w:space="0" w:color="000000"/>
+            </w:tcBorders>
+          </w:tcPr>
+          <w:p>
+            <w:pPr>
+              <w:pStyle w:val="Compact"/>
+            </w:pPr>
+          </w:p>
+        </w:tc>
+        <w:tc>
+          <w:tcPr>
             <w:tcBorders>
               <w:top w:val="single" w:sz="4" w:space="0" w:color="000000"/>
               <w:left w:val="single" w:sz="4" w:space="0" w:color="000000"/>
@@ -1953,12 +1593,6 @@
               <w:bottom w:val="single" w:sz="4" w:space="0" w:color="000000"/>
               <w:right w:val="single" w:sz="4" w:space="0" w:color="000000"/>
             </w:tcBorders>
-            <w:tcBorders>
-              <w:top w:val="single" w:sz="4" w:space="0" w:color="000000"/>
-              <w:left w:val="single" w:sz="4" w:space="0" w:color="000000"/>
-              <w:bottom w:val="single" w:sz="4" w:space="0" w:color="000000"/>
-              <w:right w:val="single" w:sz="4" w:space="0" w:color="000000"/>
-            </w:tcBorders>
           </w:tcPr>
           <w:p>
             <w:pPr>
@@ -1971,12 +1605,6 @@
         </w:tc>
         <w:tc>
           <w:tcPr>
-            <w:tcBorders>
-              <w:top w:val="single" w:sz="4" w:space="0" w:color="000000"/>
-              <w:left w:val="single" w:sz="4" w:space="0" w:color="000000"/>
-              <w:bottom w:val="single" w:sz="4" w:space="0" w:color="000000"/>
-              <w:right w:val="single" w:sz="4" w:space="0" w:color="000000"/>
-            </w:tcBorders>
             <w:tcBorders>
               <w:top w:val="single" w:sz="4" w:space="0" w:color="000000"/>
               <w:left w:val="single" w:sz="4" w:space="0" w:color="000000"/>
@@ -2003,12 +1631,6 @@
               <w:bottom w:val="single" w:sz="4" w:space="0" w:color="000000"/>
               <w:right w:val="single" w:sz="4" w:space="0" w:color="000000"/>
             </w:tcBorders>
-            <w:tcBorders>
-              <w:top w:val="single" w:sz="4" w:space="0" w:color="000000"/>
-              <w:left w:val="single" w:sz="4" w:space="0" w:color="000000"/>
-              <w:bottom w:val="single" w:sz="4" w:space="0" w:color="000000"/>
-              <w:right w:val="single" w:sz="4" w:space="0" w:color="000000"/>
-            </w:tcBorders>
           </w:tcPr>
           <w:p>
             <w:pPr>
@@ -2021,12 +1643,6 @@
         </w:tc>
         <w:tc>
           <w:tcPr>
-            <w:tcBorders>
-              <w:top w:val="single" w:sz="4" w:space="0" w:color="000000"/>
-              <w:left w:val="single" w:sz="4" w:space="0" w:color="000000"/>
-              <w:bottom w:val="single" w:sz="4" w:space="0" w:color="000000"/>
-              <w:right w:val="single" w:sz="4" w:space="0" w:color="000000"/>
-            </w:tcBorders>
             <w:tcBorders>
               <w:top w:val="single" w:sz="4" w:space="0" w:color="000000"/>
               <w:left w:val="single" w:sz="4" w:space="0" w:color="000000"/>
@@ -2050,12 +1666,6 @@
               <w:bottom w:val="single" w:sz="4" w:space="0" w:color="000000"/>
               <w:right w:val="single" w:sz="4" w:space="0" w:color="000000"/>
             </w:tcBorders>
-            <w:tcBorders>
-              <w:top w:val="single" w:sz="4" w:space="0" w:color="000000"/>
-              <w:left w:val="single" w:sz="4" w:space="0" w:color="000000"/>
-              <w:bottom w:val="single" w:sz="4" w:space="0" w:color="000000"/>
-              <w:right w:val="single" w:sz="4" w:space="0" w:color="000000"/>
-            </w:tcBorders>
           </w:tcPr>
           <w:p>
             <w:pPr>
@@ -2068,12 +1678,6 @@
         </w:tc>
         <w:tc>
           <w:tcPr>
-            <w:tcBorders>
-              <w:top w:val="single" w:sz="4" w:space="0" w:color="000000"/>
-              <w:left w:val="single" w:sz="4" w:space="0" w:color="000000"/>
-              <w:bottom w:val="single" w:sz="4" w:space="0" w:color="000000"/>
-              <w:right w:val="single" w:sz="4" w:space="0" w:color="000000"/>
-            </w:tcBorders>
             <w:tcBorders>
               <w:top w:val="single" w:sz="4" w:space="0" w:color="000000"/>
               <w:left w:val="single" w:sz="4" w:space="0" w:color="000000"/>
@@ -2100,12 +1704,6 @@
               <w:bottom w:val="single" w:sz="4" w:space="0" w:color="000000"/>
               <w:right w:val="single" w:sz="4" w:space="0" w:color="000000"/>
             </w:tcBorders>
-            <w:tcBorders>
-              <w:top w:val="single" w:sz="4" w:space="0" w:color="000000"/>
-              <w:left w:val="single" w:sz="4" w:space="0" w:color="000000"/>
-              <w:bottom w:val="single" w:sz="4" w:space="0" w:color="000000"/>
-              <w:right w:val="single" w:sz="4" w:space="0" w:color="000000"/>
-            </w:tcBorders>
           </w:tcPr>
           <w:p>
             <w:pPr>
@@ -2118,12 +1716,6 @@
         </w:tc>
         <w:tc>
           <w:tcPr>
-            <w:tcBorders>
-              <w:top w:val="single" w:sz="4" w:space="0" w:color="000000"/>
-              <w:left w:val="single" w:sz="4" w:space="0" w:color="000000"/>
-              <w:bottom w:val="single" w:sz="4" w:space="0" w:color="000000"/>
-              <w:right w:val="single" w:sz="4" w:space="0" w:color="000000"/>
-            </w:tcBorders>
             <w:tcBorders>
               <w:top w:val="single" w:sz="4" w:space="0" w:color="000000"/>
               <w:left w:val="single" w:sz="4" w:space="0" w:color="000000"/>
@@ -2147,12 +1739,6 @@
               <w:bottom w:val="single" w:sz="4" w:space="0" w:color="000000"/>
               <w:right w:val="single" w:sz="4" w:space="0" w:color="000000"/>
             </w:tcBorders>
-            <w:tcBorders>
-              <w:top w:val="single" w:sz="4" w:space="0" w:color="000000"/>
-              <w:left w:val="single" w:sz="4" w:space="0" w:color="000000"/>
-              <w:bottom w:val="single" w:sz="4" w:space="0" w:color="000000"/>
-              <w:right w:val="single" w:sz="4" w:space="0" w:color="000000"/>
-            </w:tcBorders>
           </w:tcPr>
           <w:p>
             <w:pPr>
@@ -2165,12 +1751,6 @@
         </w:tc>
         <w:tc>
           <w:tcPr>
-            <w:tcBorders>
-              <w:top w:val="single" w:sz="4" w:space="0" w:color="000000"/>
-              <w:left w:val="single" w:sz="4" w:space="0" w:color="000000"/>
-              <w:bottom w:val="single" w:sz="4" w:space="0" w:color="000000"/>
-              <w:right w:val="single" w:sz="4" w:space="0" w:color="000000"/>
-            </w:tcBorders>
             <w:tcBorders>
               <w:top w:val="single" w:sz="4" w:space="0" w:color="000000"/>
               <w:left w:val="single" w:sz="4" w:space="0" w:color="000000"/>
@@ -2194,12 +1774,6 @@
               <w:bottom w:val="single" w:sz="4" w:space="0" w:color="000000"/>
               <w:right w:val="single" w:sz="4" w:space="0" w:color="000000"/>
             </w:tcBorders>
-            <w:tcBorders>
-              <w:top w:val="single" w:sz="4" w:space="0" w:color="000000"/>
-              <w:left w:val="single" w:sz="4" w:space="0" w:color="000000"/>
-              <w:bottom w:val="single" w:sz="4" w:space="0" w:color="000000"/>
-              <w:right w:val="single" w:sz="4" w:space="0" w:color="000000"/>
-            </w:tcBorders>
           </w:tcPr>
           <w:p>
             <w:pPr>
@@ -2212,12 +1786,6 @@
         </w:tc>
         <w:tc>
           <w:tcPr>
-            <w:tcBorders>
-              <w:top w:val="single" w:sz="4" w:space="0" w:color="000000"/>
-              <w:left w:val="single" w:sz="4" w:space="0" w:color="000000"/>
-              <w:bottom w:val="single" w:sz="4" w:space="0" w:color="000000"/>
-              <w:right w:val="single" w:sz="4" w:space="0" w:color="000000"/>
-            </w:tcBorders>
             <w:tcBorders>
               <w:top w:val="single" w:sz="4" w:space="0" w:color="000000"/>
               <w:left w:val="single" w:sz="4" w:space="0" w:color="000000"/>
@@ -2318,12 +1886,6 @@
               <w:bottom w:val="single" w:sz="4" w:space="0" w:color="000000"/>
               <w:right w:val="single" w:sz="4" w:space="0" w:color="000000"/>
             </w:tcBorders>
-            <w:tcBorders>
-              <w:top w:val="single" w:sz="4" w:space="0" w:color="000000"/>
-              <w:left w:val="single" w:sz="4" w:space="0" w:color="000000"/>
-              <w:bottom w:val="single" w:sz="4" w:space="0" w:color="000000"/>
-              <w:right w:val="single" w:sz="4" w:space="0" w:color="000000"/>
-            </w:tcBorders>
           </w:tcPr>
           <w:p>
             <w:pPr>
@@ -2336,12 +1898,6 @@
         </w:tc>
         <w:tc>
           <w:tcPr>
-            <w:tcBorders>
-              <w:top w:val="single" w:sz="4" w:space="0" w:color="000000"/>
-              <w:left w:val="single" w:sz="4" w:space="0" w:color="000000"/>
-              <w:bottom w:val="single" w:sz="4" w:space="0" w:color="000000"/>
-              <w:right w:val="single" w:sz="4" w:space="0" w:color="000000"/>
-            </w:tcBorders>
             <w:tcBorders>
               <w:top w:val="single" w:sz="4" w:space="0" w:color="000000"/>
               <w:left w:val="single" w:sz="4" w:space="0" w:color="000000"/>
@@ -2368,12 +1924,6 @@
               <w:bottom w:val="single" w:sz="4" w:space="0" w:color="000000"/>
               <w:right w:val="single" w:sz="4" w:space="0" w:color="000000"/>
             </w:tcBorders>
-            <w:tcBorders>
-              <w:top w:val="single" w:sz="4" w:space="0" w:color="000000"/>
-              <w:left w:val="single" w:sz="4" w:space="0" w:color="000000"/>
-              <w:bottom w:val="single" w:sz="4" w:space="0" w:color="000000"/>
-              <w:right w:val="single" w:sz="4" w:space="0" w:color="000000"/>
-            </w:tcBorders>
           </w:tcPr>
           <w:p>
             <w:pPr>
@@ -2386,12 +1936,6 @@
         </w:tc>
         <w:tc>
           <w:tcPr>
-            <w:tcBorders>
-              <w:top w:val="single" w:sz="4" w:space="0" w:color="000000"/>
-              <w:left w:val="single" w:sz="4" w:space="0" w:color="000000"/>
-              <w:bottom w:val="single" w:sz="4" w:space="0" w:color="000000"/>
-              <w:right w:val="single" w:sz="4" w:space="0" w:color="000000"/>
-            </w:tcBorders>
             <w:tcBorders>
               <w:top w:val="single" w:sz="4" w:space="0" w:color="000000"/>
               <w:left w:val="single" w:sz="4" w:space="0" w:color="000000"/>
@@ -2415,12 +1959,6 @@
               <w:bottom w:val="single" w:sz="4" w:space="0" w:color="000000"/>
               <w:right w:val="single" w:sz="4" w:space="0" w:color="000000"/>
             </w:tcBorders>
-            <w:tcBorders>
-              <w:top w:val="single" w:sz="4" w:space="0" w:color="000000"/>
-              <w:left w:val="single" w:sz="4" w:space="0" w:color="000000"/>
-              <w:bottom w:val="single" w:sz="4" w:space="0" w:color="000000"/>
-              <w:right w:val="single" w:sz="4" w:space="0" w:color="000000"/>
-            </w:tcBorders>
           </w:tcPr>
           <w:p>
             <w:pPr>
@@ -2433,12 +1971,6 @@
         </w:tc>
         <w:tc>
           <w:tcPr>
-            <w:tcBorders>
-              <w:top w:val="single" w:sz="4" w:space="0" w:color="000000"/>
-              <w:left w:val="single" w:sz="4" w:space="0" w:color="000000"/>
-              <w:bottom w:val="single" w:sz="4" w:space="0" w:color="000000"/>
-              <w:right w:val="single" w:sz="4" w:space="0" w:color="000000"/>
-            </w:tcBorders>
             <w:tcBorders>
               <w:top w:val="single" w:sz="4" w:space="0" w:color="000000"/>
               <w:left w:val="single" w:sz="4" w:space="0" w:color="000000"/>
@@ -2462,12 +1994,6 @@
               <w:bottom w:val="single" w:sz="4" w:space="0" w:color="000000"/>
               <w:right w:val="single" w:sz="4" w:space="0" w:color="000000"/>
             </w:tcBorders>
-            <w:tcBorders>
-              <w:top w:val="single" w:sz="4" w:space="0" w:color="000000"/>
-              <w:left w:val="single" w:sz="4" w:space="0" w:color="000000"/>
-              <w:bottom w:val="single" w:sz="4" w:space="0" w:color="000000"/>
-              <w:right w:val="single" w:sz="4" w:space="0" w:color="000000"/>
-            </w:tcBorders>
           </w:tcPr>
           <w:p>
             <w:pPr>
@@ -2480,12 +2006,6 @@
         </w:tc>
         <w:tc>
           <w:tcPr>
-            <w:tcBorders>
-              <w:top w:val="single" w:sz="4" w:space="0" w:color="000000"/>
-              <w:left w:val="single" w:sz="4" w:space="0" w:color="000000"/>
-              <w:bottom w:val="single" w:sz="4" w:space="0" w:color="000000"/>
-              <w:right w:val="single" w:sz="4" w:space="0" w:color="000000"/>
-            </w:tcBorders>
             <w:tcBorders>
               <w:top w:val="single" w:sz="4" w:space="0" w:color="000000"/>
               <w:left w:val="single" w:sz="4" w:space="0" w:color="000000"/>
@@ -2559,12 +2079,6 @@
               <w:bottom w:val="single" w:sz="4" w:space="0" w:color="000000"/>
               <w:right w:val="single" w:sz="4" w:space="0" w:color="000000"/>
             </w:tcBorders>
-            <w:tcBorders>
-              <w:top w:val="single" w:sz="4" w:space="0" w:color="000000"/>
-              <w:left w:val="single" w:sz="4" w:space="0" w:color="000000"/>
-              <w:bottom w:val="single" w:sz="4" w:space="0" w:color="000000"/>
-              <w:right w:val="single" w:sz="4" w:space="0" w:color="000000"/>
-            </w:tcBorders>
           </w:tcPr>
           <w:p>
             <w:pPr>
@@ -2583,12 +2097,6 @@
               <w:bottom w:val="single" w:sz="4" w:space="0" w:color="000000"/>
               <w:right w:val="single" w:sz="4" w:space="0" w:color="000000"/>
             </w:tcBorders>
-            <w:tcBorders>
-              <w:top w:val="single" w:sz="4" w:space="0" w:color="000000"/>
-              <w:left w:val="single" w:sz="4" w:space="0" w:color="000000"/>
-              <w:bottom w:val="single" w:sz="4" w:space="0" w:color="000000"/>
-              <w:right w:val="single" w:sz="4" w:space="0" w:color="000000"/>
-            </w:tcBorders>
           </w:tcPr>
           <w:p>
             <w:pPr>
@@ -2607,12 +2115,6 @@
               <w:bottom w:val="single" w:sz="4" w:space="0" w:color="000000"/>
               <w:right w:val="single" w:sz="4" w:space="0" w:color="000000"/>
             </w:tcBorders>
-            <w:tcBorders>
-              <w:top w:val="single" w:sz="4" w:space="0" w:color="000000"/>
-              <w:left w:val="single" w:sz="4" w:space="0" w:color="000000"/>
-              <w:bottom w:val="single" w:sz="4" w:space="0" w:color="000000"/>
-              <w:right w:val="single" w:sz="4" w:space="0" w:color="000000"/>
-            </w:tcBorders>
           </w:tcPr>
           <w:p>
             <w:pPr>
@@ -2631,12 +2133,6 @@
               <w:bottom w:val="single" w:sz="4" w:space="0" w:color="000000"/>
               <w:right w:val="single" w:sz="4" w:space="0" w:color="000000"/>
             </w:tcBorders>
-            <w:tcBorders>
-              <w:top w:val="single" w:sz="4" w:space="0" w:color="000000"/>
-              <w:left w:val="single" w:sz="4" w:space="0" w:color="000000"/>
-              <w:bottom w:val="single" w:sz="4" w:space="0" w:color="000000"/>
-              <w:right w:val="single" w:sz="4" w:space="0" w:color="000000"/>
-            </w:tcBorders>
           </w:tcPr>
           <w:p>
             <w:pPr>
@@ -2655,12 +2151,6 @@
               <w:bottom w:val="single" w:sz="4" w:space="0" w:color="000000"/>
               <w:right w:val="single" w:sz="4" w:space="0" w:color="000000"/>
             </w:tcBorders>
-            <w:tcBorders>
-              <w:top w:val="single" w:sz="4" w:space="0" w:color="000000"/>
-              <w:left w:val="single" w:sz="4" w:space="0" w:color="000000"/>
-              <w:bottom w:val="single" w:sz="4" w:space="0" w:color="000000"/>
-              <w:right w:val="single" w:sz="4" w:space="0" w:color="000000"/>
-            </w:tcBorders>
           </w:tcPr>
           <w:p>
             <w:pPr>
@@ -2673,12 +2163,6 @@
         </w:tc>
         <w:tc>
           <w:tcPr>
-            <w:tcBorders>
-              <w:top w:val="single" w:sz="4" w:space="0" w:color="000000"/>
-              <w:left w:val="single" w:sz="4" w:space="0" w:color="000000"/>
-              <w:bottom w:val="single" w:sz="4" w:space="0" w:color="000000"/>
-              <w:right w:val="single" w:sz="4" w:space="0" w:color="000000"/>
-            </w:tcBorders>
             <w:tcBorders>
               <w:top w:val="single" w:sz="4" w:space="0" w:color="000000"/>
               <w:left w:val="single" w:sz="4" w:space="0" w:color="000000"/>
@@ -2705,12 +2189,6 @@
               <w:bottom w:val="single" w:sz="4" w:space="0" w:color="000000"/>
               <w:right w:val="single" w:sz="4" w:space="0" w:color="000000"/>
             </w:tcBorders>
-            <w:tcBorders>
-              <w:top w:val="single" w:sz="4" w:space="0" w:color="000000"/>
-              <w:left w:val="single" w:sz="4" w:space="0" w:color="000000"/>
-              <w:bottom w:val="single" w:sz="4" w:space="0" w:color="000000"/>
-              <w:right w:val="single" w:sz="4" w:space="0" w:color="000000"/>
-            </w:tcBorders>
           </w:tcPr>
           <w:p>
             <w:pPr>
@@ -2729,90 +2207,60 @@
               <w:bottom w:val="single" w:sz="4" w:space="0" w:color="000000"/>
               <w:right w:val="single" w:sz="4" w:space="0" w:color="000000"/>
             </w:tcBorders>
-            <w:tcBorders>
-              <w:top w:val="single" w:sz="4" w:space="0" w:color="000000"/>
-              <w:left w:val="single" w:sz="4" w:space="0" w:color="000000"/>
-              <w:bottom w:val="single" w:sz="4" w:space="0" w:color="000000"/>
-              <w:right w:val="single" w:sz="4" w:space="0" w:color="000000"/>
-            </w:tcBorders>
-          </w:tcPr>
-          <w:p>
-            <w:pPr>
-              <w:pStyle w:val="Compact"/>
-            </w:pPr>
-          </w:p>
-        </w:tc>
-        <w:tc>
-          <w:tcPr>
-            <w:tcBorders>
-              <w:top w:val="single" w:sz="4" w:space="0" w:color="000000"/>
-              <w:left w:val="single" w:sz="4" w:space="0" w:color="000000"/>
-              <w:bottom w:val="single" w:sz="4" w:space="0" w:color="000000"/>
-              <w:right w:val="single" w:sz="4" w:space="0" w:color="000000"/>
-            </w:tcBorders>
-            <w:tcBorders>
-              <w:top w:val="single" w:sz="4" w:space="0" w:color="000000"/>
-              <w:left w:val="single" w:sz="4" w:space="0" w:color="000000"/>
-              <w:bottom w:val="single" w:sz="4" w:space="0" w:color="000000"/>
-              <w:right w:val="single" w:sz="4" w:space="0" w:color="000000"/>
-            </w:tcBorders>
-          </w:tcPr>
-          <w:p>
-            <w:pPr>
-              <w:pStyle w:val="Compact"/>
-            </w:pPr>
-          </w:p>
-        </w:tc>
-        <w:tc>
-          <w:tcPr>
-            <w:tcBorders>
-              <w:top w:val="single" w:sz="4" w:space="0" w:color="000000"/>
-              <w:left w:val="single" w:sz="4" w:space="0" w:color="000000"/>
-              <w:bottom w:val="single" w:sz="4" w:space="0" w:color="000000"/>
-              <w:right w:val="single" w:sz="4" w:space="0" w:color="000000"/>
-            </w:tcBorders>
-            <w:tcBorders>
-              <w:top w:val="single" w:sz="4" w:space="0" w:color="000000"/>
-              <w:left w:val="single" w:sz="4" w:space="0" w:color="000000"/>
-              <w:bottom w:val="single" w:sz="4" w:space="0" w:color="000000"/>
-              <w:right w:val="single" w:sz="4" w:space="0" w:color="000000"/>
-            </w:tcBorders>
-          </w:tcPr>
-          <w:p>
-            <w:pPr>
-              <w:pStyle w:val="Compact"/>
-            </w:pPr>
-          </w:p>
-        </w:tc>
-        <w:tc>
-          <w:tcPr>
-            <w:tcBorders>
-              <w:top w:val="single" w:sz="4" w:space="0" w:color="000000"/>
-              <w:left w:val="single" w:sz="4" w:space="0" w:color="000000"/>
-              <w:bottom w:val="single" w:sz="4" w:space="0" w:color="000000"/>
-              <w:right w:val="single" w:sz="4" w:space="0" w:color="000000"/>
-            </w:tcBorders>
-            <w:tcBorders>
-              <w:top w:val="single" w:sz="4" w:space="0" w:color="000000"/>
-              <w:left w:val="single" w:sz="4" w:space="0" w:color="000000"/>
-              <w:bottom w:val="single" w:sz="4" w:space="0" w:color="000000"/>
-              <w:right w:val="single" w:sz="4" w:space="0" w:color="000000"/>
-            </w:tcBorders>
-          </w:tcPr>
-          <w:p>
-            <w:pPr>
-              <w:pStyle w:val="Compact"/>
-            </w:pPr>
-          </w:p>
-        </w:tc>
-        <w:tc>
-          <w:tcPr>
-            <w:tcBorders>
-              <w:top w:val="single" w:sz="4" w:space="0" w:color="000000"/>
-              <w:left w:val="single" w:sz="4" w:space="0" w:color="000000"/>
-              <w:bottom w:val="single" w:sz="4" w:space="0" w:color="000000"/>
-              <w:right w:val="single" w:sz="4" w:space="0" w:color="000000"/>
-            </w:tcBorders>
+          </w:tcPr>
+          <w:p>
+            <w:pPr>
+              <w:pStyle w:val="Compact"/>
+            </w:pPr>
+          </w:p>
+        </w:tc>
+        <w:tc>
+          <w:tcPr>
+            <w:tcBorders>
+              <w:top w:val="single" w:sz="4" w:space="0" w:color="000000"/>
+              <w:left w:val="single" w:sz="4" w:space="0" w:color="000000"/>
+              <w:bottom w:val="single" w:sz="4" w:space="0" w:color="000000"/>
+              <w:right w:val="single" w:sz="4" w:space="0" w:color="000000"/>
+            </w:tcBorders>
+          </w:tcPr>
+          <w:p>
+            <w:pPr>
+              <w:pStyle w:val="Compact"/>
+            </w:pPr>
+          </w:p>
+        </w:tc>
+        <w:tc>
+          <w:tcPr>
+            <w:tcBorders>
+              <w:top w:val="single" w:sz="4" w:space="0" w:color="000000"/>
+              <w:left w:val="single" w:sz="4" w:space="0" w:color="000000"/>
+              <w:bottom w:val="single" w:sz="4" w:space="0" w:color="000000"/>
+              <w:right w:val="single" w:sz="4" w:space="0" w:color="000000"/>
+            </w:tcBorders>
+          </w:tcPr>
+          <w:p>
+            <w:pPr>
+              <w:pStyle w:val="Compact"/>
+            </w:pPr>
+          </w:p>
+        </w:tc>
+        <w:tc>
+          <w:tcPr>
+            <w:tcBorders>
+              <w:top w:val="single" w:sz="4" w:space="0" w:color="000000"/>
+              <w:left w:val="single" w:sz="4" w:space="0" w:color="000000"/>
+              <w:bottom w:val="single" w:sz="4" w:space="0" w:color="000000"/>
+              <w:right w:val="single" w:sz="4" w:space="0" w:color="000000"/>
+            </w:tcBorders>
+          </w:tcPr>
+          <w:p>
+            <w:pPr>
+              <w:pStyle w:val="Compact"/>
+            </w:pPr>
+          </w:p>
+        </w:tc>
+        <w:tc>
+          <w:tcPr>
             <w:tcBorders>
               <w:top w:val="single" w:sz="4" w:space="0" w:color="000000"/>
               <w:left w:val="single" w:sz="4" w:space="0" w:color="000000"/>
@@ -2836,12 +2284,6 @@
               <w:bottom w:val="single" w:sz="4" w:space="0" w:color="000000"/>
               <w:right w:val="single" w:sz="4" w:space="0" w:color="000000"/>
             </w:tcBorders>
-            <w:tcBorders>
-              <w:top w:val="single" w:sz="4" w:space="0" w:color="000000"/>
-              <w:left w:val="single" w:sz="4" w:space="0" w:color="000000"/>
-              <w:bottom w:val="single" w:sz="4" w:space="0" w:color="000000"/>
-              <w:right w:val="single" w:sz="4" w:space="0" w:color="000000"/>
-            </w:tcBorders>
           </w:tcPr>
           <w:p>
             <w:pPr>
@@ -2860,90 +2302,60 @@
               <w:bottom w:val="single" w:sz="4" w:space="0" w:color="000000"/>
               <w:right w:val="single" w:sz="4" w:space="0" w:color="000000"/>
             </w:tcBorders>
-            <w:tcBorders>
-              <w:top w:val="single" w:sz="4" w:space="0" w:color="000000"/>
-              <w:left w:val="single" w:sz="4" w:space="0" w:color="000000"/>
-              <w:bottom w:val="single" w:sz="4" w:space="0" w:color="000000"/>
-              <w:right w:val="single" w:sz="4" w:space="0" w:color="000000"/>
-            </w:tcBorders>
-          </w:tcPr>
-          <w:p>
-            <w:pPr>
-              <w:pStyle w:val="Compact"/>
-            </w:pPr>
-          </w:p>
-        </w:tc>
-        <w:tc>
-          <w:tcPr>
-            <w:tcBorders>
-              <w:top w:val="single" w:sz="4" w:space="0" w:color="000000"/>
-              <w:left w:val="single" w:sz="4" w:space="0" w:color="000000"/>
-              <w:bottom w:val="single" w:sz="4" w:space="0" w:color="000000"/>
-              <w:right w:val="single" w:sz="4" w:space="0" w:color="000000"/>
-            </w:tcBorders>
-            <w:tcBorders>
-              <w:top w:val="single" w:sz="4" w:space="0" w:color="000000"/>
-              <w:left w:val="single" w:sz="4" w:space="0" w:color="000000"/>
-              <w:bottom w:val="single" w:sz="4" w:space="0" w:color="000000"/>
-              <w:right w:val="single" w:sz="4" w:space="0" w:color="000000"/>
-            </w:tcBorders>
-          </w:tcPr>
-          <w:p>
-            <w:pPr>
-              <w:pStyle w:val="Compact"/>
-            </w:pPr>
-          </w:p>
-        </w:tc>
-        <w:tc>
-          <w:tcPr>
-            <w:tcBorders>
-              <w:top w:val="single" w:sz="4" w:space="0" w:color="000000"/>
-              <w:left w:val="single" w:sz="4" w:space="0" w:color="000000"/>
-              <w:bottom w:val="single" w:sz="4" w:space="0" w:color="000000"/>
-              <w:right w:val="single" w:sz="4" w:space="0" w:color="000000"/>
-            </w:tcBorders>
-            <w:tcBorders>
-              <w:top w:val="single" w:sz="4" w:space="0" w:color="000000"/>
-              <w:left w:val="single" w:sz="4" w:space="0" w:color="000000"/>
-              <w:bottom w:val="single" w:sz="4" w:space="0" w:color="000000"/>
-              <w:right w:val="single" w:sz="4" w:space="0" w:color="000000"/>
-            </w:tcBorders>
-          </w:tcPr>
-          <w:p>
-            <w:pPr>
-              <w:pStyle w:val="Compact"/>
-            </w:pPr>
-          </w:p>
-        </w:tc>
-        <w:tc>
-          <w:tcPr>
-            <w:tcBorders>
-              <w:top w:val="single" w:sz="4" w:space="0" w:color="000000"/>
-              <w:left w:val="single" w:sz="4" w:space="0" w:color="000000"/>
-              <w:bottom w:val="single" w:sz="4" w:space="0" w:color="000000"/>
-              <w:right w:val="single" w:sz="4" w:space="0" w:color="000000"/>
-            </w:tcBorders>
-            <w:tcBorders>
-              <w:top w:val="single" w:sz="4" w:space="0" w:color="000000"/>
-              <w:left w:val="single" w:sz="4" w:space="0" w:color="000000"/>
-              <w:bottom w:val="single" w:sz="4" w:space="0" w:color="000000"/>
-              <w:right w:val="single" w:sz="4" w:space="0" w:color="000000"/>
-            </w:tcBorders>
-          </w:tcPr>
-          <w:p>
-            <w:pPr>
-              <w:pStyle w:val="Compact"/>
-            </w:pPr>
-          </w:p>
-        </w:tc>
-        <w:tc>
-          <w:tcPr>
-            <w:tcBorders>
-              <w:top w:val="single" w:sz="4" w:space="0" w:color="000000"/>
-              <w:left w:val="single" w:sz="4" w:space="0" w:color="000000"/>
-              <w:bottom w:val="single" w:sz="4" w:space="0" w:color="000000"/>
-              <w:right w:val="single" w:sz="4" w:space="0" w:color="000000"/>
-            </w:tcBorders>
+          </w:tcPr>
+          <w:p>
+            <w:pPr>
+              <w:pStyle w:val="Compact"/>
+            </w:pPr>
+          </w:p>
+        </w:tc>
+        <w:tc>
+          <w:tcPr>
+            <w:tcBorders>
+              <w:top w:val="single" w:sz="4" w:space="0" w:color="000000"/>
+              <w:left w:val="single" w:sz="4" w:space="0" w:color="000000"/>
+              <w:bottom w:val="single" w:sz="4" w:space="0" w:color="000000"/>
+              <w:right w:val="single" w:sz="4" w:space="0" w:color="000000"/>
+            </w:tcBorders>
+          </w:tcPr>
+          <w:p>
+            <w:pPr>
+              <w:pStyle w:val="Compact"/>
+            </w:pPr>
+          </w:p>
+        </w:tc>
+        <w:tc>
+          <w:tcPr>
+            <w:tcBorders>
+              <w:top w:val="single" w:sz="4" w:space="0" w:color="000000"/>
+              <w:left w:val="single" w:sz="4" w:space="0" w:color="000000"/>
+              <w:bottom w:val="single" w:sz="4" w:space="0" w:color="000000"/>
+              <w:right w:val="single" w:sz="4" w:space="0" w:color="000000"/>
+            </w:tcBorders>
+          </w:tcPr>
+          <w:p>
+            <w:pPr>
+              <w:pStyle w:val="Compact"/>
+            </w:pPr>
+          </w:p>
+        </w:tc>
+        <w:tc>
+          <w:tcPr>
+            <w:tcBorders>
+              <w:top w:val="single" w:sz="4" w:space="0" w:color="000000"/>
+              <w:left w:val="single" w:sz="4" w:space="0" w:color="000000"/>
+              <w:bottom w:val="single" w:sz="4" w:space="0" w:color="000000"/>
+              <w:right w:val="single" w:sz="4" w:space="0" w:color="000000"/>
+            </w:tcBorders>
+          </w:tcPr>
+          <w:p>
+            <w:pPr>
+              <w:pStyle w:val="Compact"/>
+            </w:pPr>
+          </w:p>
+        </w:tc>
+        <w:tc>
+          <w:tcPr>
             <w:tcBorders>
               <w:top w:val="single" w:sz="4" w:space="0" w:color="000000"/>
               <w:left w:val="single" w:sz="4" w:space="0" w:color="000000"/>
@@ -2967,12 +2379,6 @@
               <w:bottom w:val="single" w:sz="4" w:space="0" w:color="000000"/>
               <w:right w:val="single" w:sz="4" w:space="0" w:color="000000"/>
             </w:tcBorders>
-            <w:tcBorders>
-              <w:top w:val="single" w:sz="4" w:space="0" w:color="000000"/>
-              <w:left w:val="single" w:sz="4" w:space="0" w:color="000000"/>
-              <w:bottom w:val="single" w:sz="4" w:space="0" w:color="000000"/>
-              <w:right w:val="single" w:sz="4" w:space="0" w:color="000000"/>
-            </w:tcBorders>
           </w:tcPr>
           <w:p>
             <w:pPr>
@@ -2991,90 +2397,60 @@
               <w:bottom w:val="single" w:sz="4" w:space="0" w:color="000000"/>
               <w:right w:val="single" w:sz="4" w:space="0" w:color="000000"/>
             </w:tcBorders>
-            <w:tcBorders>
-              <w:top w:val="single" w:sz="4" w:space="0" w:color="000000"/>
-              <w:left w:val="single" w:sz="4" w:space="0" w:color="000000"/>
-              <w:bottom w:val="single" w:sz="4" w:space="0" w:color="000000"/>
-              <w:right w:val="single" w:sz="4" w:space="0" w:color="000000"/>
-            </w:tcBorders>
-          </w:tcPr>
-          <w:p>
-            <w:pPr>
-              <w:pStyle w:val="Compact"/>
-            </w:pPr>
-          </w:p>
-        </w:tc>
-        <w:tc>
-          <w:tcPr>
-            <w:tcBorders>
-              <w:top w:val="single" w:sz="4" w:space="0" w:color="000000"/>
-              <w:left w:val="single" w:sz="4" w:space="0" w:color="000000"/>
-              <w:bottom w:val="single" w:sz="4" w:space="0" w:color="000000"/>
-              <w:right w:val="single" w:sz="4" w:space="0" w:color="000000"/>
-            </w:tcBorders>
-            <w:tcBorders>
-              <w:top w:val="single" w:sz="4" w:space="0" w:color="000000"/>
-              <w:left w:val="single" w:sz="4" w:space="0" w:color="000000"/>
-              <w:bottom w:val="single" w:sz="4" w:space="0" w:color="000000"/>
-              <w:right w:val="single" w:sz="4" w:space="0" w:color="000000"/>
-            </w:tcBorders>
-          </w:tcPr>
-          <w:p>
-            <w:pPr>
-              <w:pStyle w:val="Compact"/>
-            </w:pPr>
-          </w:p>
-        </w:tc>
-        <w:tc>
-          <w:tcPr>
-            <w:tcBorders>
-              <w:top w:val="single" w:sz="4" w:space="0" w:color="000000"/>
-              <w:left w:val="single" w:sz="4" w:space="0" w:color="000000"/>
-              <w:bottom w:val="single" w:sz="4" w:space="0" w:color="000000"/>
-              <w:right w:val="single" w:sz="4" w:space="0" w:color="000000"/>
-            </w:tcBorders>
-            <w:tcBorders>
-              <w:top w:val="single" w:sz="4" w:space="0" w:color="000000"/>
-              <w:left w:val="single" w:sz="4" w:space="0" w:color="000000"/>
-              <w:bottom w:val="single" w:sz="4" w:space="0" w:color="000000"/>
-              <w:right w:val="single" w:sz="4" w:space="0" w:color="000000"/>
-            </w:tcBorders>
-          </w:tcPr>
-          <w:p>
-            <w:pPr>
-              <w:pStyle w:val="Compact"/>
-            </w:pPr>
-          </w:p>
-        </w:tc>
-        <w:tc>
-          <w:tcPr>
-            <w:tcBorders>
-              <w:top w:val="single" w:sz="4" w:space="0" w:color="000000"/>
-              <w:left w:val="single" w:sz="4" w:space="0" w:color="000000"/>
-              <w:bottom w:val="single" w:sz="4" w:space="0" w:color="000000"/>
-              <w:right w:val="single" w:sz="4" w:space="0" w:color="000000"/>
-            </w:tcBorders>
-            <w:tcBorders>
-              <w:top w:val="single" w:sz="4" w:space="0" w:color="000000"/>
-              <w:left w:val="single" w:sz="4" w:space="0" w:color="000000"/>
-              <w:bottom w:val="single" w:sz="4" w:space="0" w:color="000000"/>
-              <w:right w:val="single" w:sz="4" w:space="0" w:color="000000"/>
-            </w:tcBorders>
-          </w:tcPr>
-          <w:p>
-            <w:pPr>
-              <w:pStyle w:val="Compact"/>
-            </w:pPr>
-          </w:p>
-        </w:tc>
-        <w:tc>
-          <w:tcPr>
-            <w:tcBorders>
-              <w:top w:val="single" w:sz="4" w:space="0" w:color="000000"/>
-              <w:left w:val="single" w:sz="4" w:space="0" w:color="000000"/>
-              <w:bottom w:val="single" w:sz="4" w:space="0" w:color="000000"/>
-              <w:right w:val="single" w:sz="4" w:space="0" w:color="000000"/>
-            </w:tcBorders>
+          </w:tcPr>
+          <w:p>
+            <w:pPr>
+              <w:pStyle w:val="Compact"/>
+            </w:pPr>
+          </w:p>
+        </w:tc>
+        <w:tc>
+          <w:tcPr>
+            <w:tcBorders>
+              <w:top w:val="single" w:sz="4" w:space="0" w:color="000000"/>
+              <w:left w:val="single" w:sz="4" w:space="0" w:color="000000"/>
+              <w:bottom w:val="single" w:sz="4" w:space="0" w:color="000000"/>
+              <w:right w:val="single" w:sz="4" w:space="0" w:color="000000"/>
+            </w:tcBorders>
+          </w:tcPr>
+          <w:p>
+            <w:pPr>
+              <w:pStyle w:val="Compact"/>
+            </w:pPr>
+          </w:p>
+        </w:tc>
+        <w:tc>
+          <w:tcPr>
+            <w:tcBorders>
+              <w:top w:val="single" w:sz="4" w:space="0" w:color="000000"/>
+              <w:left w:val="single" w:sz="4" w:space="0" w:color="000000"/>
+              <w:bottom w:val="single" w:sz="4" w:space="0" w:color="000000"/>
+              <w:right w:val="single" w:sz="4" w:space="0" w:color="000000"/>
+            </w:tcBorders>
+          </w:tcPr>
+          <w:p>
+            <w:pPr>
+              <w:pStyle w:val="Compact"/>
+            </w:pPr>
+          </w:p>
+        </w:tc>
+        <w:tc>
+          <w:tcPr>
+            <w:tcBorders>
+              <w:top w:val="single" w:sz="4" w:space="0" w:color="000000"/>
+              <w:left w:val="single" w:sz="4" w:space="0" w:color="000000"/>
+              <w:bottom w:val="single" w:sz="4" w:space="0" w:color="000000"/>
+              <w:right w:val="single" w:sz="4" w:space="0" w:color="000000"/>
+            </w:tcBorders>
+          </w:tcPr>
+          <w:p>
+            <w:pPr>
+              <w:pStyle w:val="Compact"/>
+            </w:pPr>
+          </w:p>
+        </w:tc>
+        <w:tc>
+          <w:tcPr>
             <w:tcBorders>
               <w:top w:val="single" w:sz="4" w:space="0" w:color="000000"/>
               <w:left w:val="single" w:sz="4" w:space="0" w:color="000000"/>
@@ -3098,12 +2474,6 @@
               <w:bottom w:val="single" w:sz="4" w:space="0" w:color="000000"/>
               <w:right w:val="single" w:sz="4" w:space="0" w:color="000000"/>
             </w:tcBorders>
-            <w:tcBorders>
-              <w:top w:val="single" w:sz="4" w:space="0" w:color="000000"/>
-              <w:left w:val="single" w:sz="4" w:space="0" w:color="000000"/>
-              <w:bottom w:val="single" w:sz="4" w:space="0" w:color="000000"/>
-              <w:right w:val="single" w:sz="4" w:space="0" w:color="000000"/>
-            </w:tcBorders>
           </w:tcPr>
           <w:p>
             <w:pPr>
@@ -3122,90 +2492,60 @@
               <w:bottom w:val="single" w:sz="4" w:space="0" w:color="000000"/>
               <w:right w:val="single" w:sz="4" w:space="0" w:color="000000"/>
             </w:tcBorders>
-            <w:tcBorders>
-              <w:top w:val="single" w:sz="4" w:space="0" w:color="000000"/>
-              <w:left w:val="single" w:sz="4" w:space="0" w:color="000000"/>
-              <w:bottom w:val="single" w:sz="4" w:space="0" w:color="000000"/>
-              <w:right w:val="single" w:sz="4" w:space="0" w:color="000000"/>
-            </w:tcBorders>
-          </w:tcPr>
-          <w:p>
-            <w:pPr>
-              <w:pStyle w:val="Compact"/>
-            </w:pPr>
-          </w:p>
-        </w:tc>
-        <w:tc>
-          <w:tcPr>
-            <w:tcBorders>
-              <w:top w:val="single" w:sz="4" w:space="0" w:color="000000"/>
-              <w:left w:val="single" w:sz="4" w:space="0" w:color="000000"/>
-              <w:bottom w:val="single" w:sz="4" w:space="0" w:color="000000"/>
-              <w:right w:val="single" w:sz="4" w:space="0" w:color="000000"/>
-            </w:tcBorders>
-            <w:tcBorders>
-              <w:top w:val="single" w:sz="4" w:space="0" w:color="000000"/>
-              <w:left w:val="single" w:sz="4" w:space="0" w:color="000000"/>
-              <w:bottom w:val="single" w:sz="4" w:space="0" w:color="000000"/>
-              <w:right w:val="single" w:sz="4" w:space="0" w:color="000000"/>
-            </w:tcBorders>
-          </w:tcPr>
-          <w:p>
-            <w:pPr>
-              <w:pStyle w:val="Compact"/>
-            </w:pPr>
-          </w:p>
-        </w:tc>
-        <w:tc>
-          <w:tcPr>
-            <w:tcBorders>
-              <w:top w:val="single" w:sz="4" w:space="0" w:color="000000"/>
-              <w:left w:val="single" w:sz="4" w:space="0" w:color="000000"/>
-              <w:bottom w:val="single" w:sz="4" w:space="0" w:color="000000"/>
-              <w:right w:val="single" w:sz="4" w:space="0" w:color="000000"/>
-            </w:tcBorders>
-            <w:tcBorders>
-              <w:top w:val="single" w:sz="4" w:space="0" w:color="000000"/>
-              <w:left w:val="single" w:sz="4" w:space="0" w:color="000000"/>
-              <w:bottom w:val="single" w:sz="4" w:space="0" w:color="000000"/>
-              <w:right w:val="single" w:sz="4" w:space="0" w:color="000000"/>
-            </w:tcBorders>
-          </w:tcPr>
-          <w:p>
-            <w:pPr>
-              <w:pStyle w:val="Compact"/>
-            </w:pPr>
-          </w:p>
-        </w:tc>
-        <w:tc>
-          <w:tcPr>
-            <w:tcBorders>
-              <w:top w:val="single" w:sz="4" w:space="0" w:color="000000"/>
-              <w:left w:val="single" w:sz="4" w:space="0" w:color="000000"/>
-              <w:bottom w:val="single" w:sz="4" w:space="0" w:color="000000"/>
-              <w:right w:val="single" w:sz="4" w:space="0" w:color="000000"/>
-            </w:tcBorders>
-            <w:tcBorders>
-              <w:top w:val="single" w:sz="4" w:space="0" w:color="000000"/>
-              <w:left w:val="single" w:sz="4" w:space="0" w:color="000000"/>
-              <w:bottom w:val="single" w:sz="4" w:space="0" w:color="000000"/>
-              <w:right w:val="single" w:sz="4" w:space="0" w:color="000000"/>
-            </w:tcBorders>
-          </w:tcPr>
-          <w:p>
-            <w:pPr>
-              <w:pStyle w:val="Compact"/>
-            </w:pPr>
-          </w:p>
-        </w:tc>
-        <w:tc>
-          <w:tcPr>
-            <w:tcBorders>
-              <w:top w:val="single" w:sz="4" w:space="0" w:color="000000"/>
-              <w:left w:val="single" w:sz="4" w:space="0" w:color="000000"/>
-              <w:bottom w:val="single" w:sz="4" w:space="0" w:color="000000"/>
-              <w:right w:val="single" w:sz="4" w:space="0" w:color="000000"/>
-            </w:tcBorders>
+          </w:tcPr>
+          <w:p>
+            <w:pPr>
+              <w:pStyle w:val="Compact"/>
+            </w:pPr>
+          </w:p>
+        </w:tc>
+        <w:tc>
+          <w:tcPr>
+            <w:tcBorders>
+              <w:top w:val="single" w:sz="4" w:space="0" w:color="000000"/>
+              <w:left w:val="single" w:sz="4" w:space="0" w:color="000000"/>
+              <w:bottom w:val="single" w:sz="4" w:space="0" w:color="000000"/>
+              <w:right w:val="single" w:sz="4" w:space="0" w:color="000000"/>
+            </w:tcBorders>
+          </w:tcPr>
+          <w:p>
+            <w:pPr>
+              <w:pStyle w:val="Compact"/>
+            </w:pPr>
+          </w:p>
+        </w:tc>
+        <w:tc>
+          <w:tcPr>
+            <w:tcBorders>
+              <w:top w:val="single" w:sz="4" w:space="0" w:color="000000"/>
+              <w:left w:val="single" w:sz="4" w:space="0" w:color="000000"/>
+              <w:bottom w:val="single" w:sz="4" w:space="0" w:color="000000"/>
+              <w:right w:val="single" w:sz="4" w:space="0" w:color="000000"/>
+            </w:tcBorders>
+          </w:tcPr>
+          <w:p>
+            <w:pPr>
+              <w:pStyle w:val="Compact"/>
+            </w:pPr>
+          </w:p>
+        </w:tc>
+        <w:tc>
+          <w:tcPr>
+            <w:tcBorders>
+              <w:top w:val="single" w:sz="4" w:space="0" w:color="000000"/>
+              <w:left w:val="single" w:sz="4" w:space="0" w:color="000000"/>
+              <w:bottom w:val="single" w:sz="4" w:space="0" w:color="000000"/>
+              <w:right w:val="single" w:sz="4" w:space="0" w:color="000000"/>
+            </w:tcBorders>
+          </w:tcPr>
+          <w:p>
+            <w:pPr>
+              <w:pStyle w:val="Compact"/>
+            </w:pPr>
+          </w:p>
+        </w:tc>
+        <w:tc>
+          <w:tcPr>
             <w:tcBorders>
               <w:top w:val="single" w:sz="4" w:space="0" w:color="000000"/>
               <w:left w:val="single" w:sz="4" w:space="0" w:color="000000"/>
@@ -3229,12 +2569,6 @@
               <w:bottom w:val="single" w:sz="4" w:space="0" w:color="000000"/>
               <w:right w:val="single" w:sz="4" w:space="0" w:color="000000"/>
             </w:tcBorders>
-            <w:tcBorders>
-              <w:top w:val="single" w:sz="4" w:space="0" w:color="000000"/>
-              <w:left w:val="single" w:sz="4" w:space="0" w:color="000000"/>
-              <w:bottom w:val="single" w:sz="4" w:space="0" w:color="000000"/>
-              <w:right w:val="single" w:sz="4" w:space="0" w:color="000000"/>
-            </w:tcBorders>
           </w:tcPr>
           <w:p>
             <w:pPr>
@@ -3253,90 +2587,60 @@
               <w:bottom w:val="single" w:sz="4" w:space="0" w:color="000000"/>
               <w:right w:val="single" w:sz="4" w:space="0" w:color="000000"/>
             </w:tcBorders>
-            <w:tcBorders>
-              <w:top w:val="single" w:sz="4" w:space="0" w:color="000000"/>
-              <w:left w:val="single" w:sz="4" w:space="0" w:color="000000"/>
-              <w:bottom w:val="single" w:sz="4" w:space="0" w:color="000000"/>
-              <w:right w:val="single" w:sz="4" w:space="0" w:color="000000"/>
-            </w:tcBorders>
-          </w:tcPr>
-          <w:p>
-            <w:pPr>
-              <w:pStyle w:val="Compact"/>
-            </w:pPr>
-          </w:p>
-        </w:tc>
-        <w:tc>
-          <w:tcPr>
-            <w:tcBorders>
-              <w:top w:val="single" w:sz="4" w:space="0" w:color="000000"/>
-              <w:left w:val="single" w:sz="4" w:space="0" w:color="000000"/>
-              <w:bottom w:val="single" w:sz="4" w:space="0" w:color="000000"/>
-              <w:right w:val="single" w:sz="4" w:space="0" w:color="000000"/>
-            </w:tcBorders>
-            <w:tcBorders>
-              <w:top w:val="single" w:sz="4" w:space="0" w:color="000000"/>
-              <w:left w:val="single" w:sz="4" w:space="0" w:color="000000"/>
-              <w:bottom w:val="single" w:sz="4" w:space="0" w:color="000000"/>
-              <w:right w:val="single" w:sz="4" w:space="0" w:color="000000"/>
-            </w:tcBorders>
-          </w:tcPr>
-          <w:p>
-            <w:pPr>
-              <w:pStyle w:val="Compact"/>
-            </w:pPr>
-          </w:p>
-        </w:tc>
-        <w:tc>
-          <w:tcPr>
-            <w:tcBorders>
-              <w:top w:val="single" w:sz="4" w:space="0" w:color="000000"/>
-              <w:left w:val="single" w:sz="4" w:space="0" w:color="000000"/>
-              <w:bottom w:val="single" w:sz="4" w:space="0" w:color="000000"/>
-              <w:right w:val="single" w:sz="4" w:space="0" w:color="000000"/>
-            </w:tcBorders>
-            <w:tcBorders>
-              <w:top w:val="single" w:sz="4" w:space="0" w:color="000000"/>
-              <w:left w:val="single" w:sz="4" w:space="0" w:color="000000"/>
-              <w:bottom w:val="single" w:sz="4" w:space="0" w:color="000000"/>
-              <w:right w:val="single" w:sz="4" w:space="0" w:color="000000"/>
-            </w:tcBorders>
-          </w:tcPr>
-          <w:p>
-            <w:pPr>
-              <w:pStyle w:val="Compact"/>
-            </w:pPr>
-          </w:p>
-        </w:tc>
-        <w:tc>
-          <w:tcPr>
-            <w:tcBorders>
-              <w:top w:val="single" w:sz="4" w:space="0" w:color="000000"/>
-              <w:left w:val="single" w:sz="4" w:space="0" w:color="000000"/>
-              <w:bottom w:val="single" w:sz="4" w:space="0" w:color="000000"/>
-              <w:right w:val="single" w:sz="4" w:space="0" w:color="000000"/>
-            </w:tcBorders>
-            <w:tcBorders>
-              <w:top w:val="single" w:sz="4" w:space="0" w:color="000000"/>
-              <w:left w:val="single" w:sz="4" w:space="0" w:color="000000"/>
-              <w:bottom w:val="single" w:sz="4" w:space="0" w:color="000000"/>
-              <w:right w:val="single" w:sz="4" w:space="0" w:color="000000"/>
-            </w:tcBorders>
-          </w:tcPr>
-          <w:p>
-            <w:pPr>
-              <w:pStyle w:val="Compact"/>
-            </w:pPr>
-          </w:p>
-        </w:tc>
-        <w:tc>
-          <w:tcPr>
-            <w:tcBorders>
-              <w:top w:val="single" w:sz="4" w:space="0" w:color="000000"/>
-              <w:left w:val="single" w:sz="4" w:space="0" w:color="000000"/>
-              <w:bottom w:val="single" w:sz="4" w:space="0" w:color="000000"/>
-              <w:right w:val="single" w:sz="4" w:space="0" w:color="000000"/>
-            </w:tcBorders>
+          </w:tcPr>
+          <w:p>
+            <w:pPr>
+              <w:pStyle w:val="Compact"/>
+            </w:pPr>
+          </w:p>
+        </w:tc>
+        <w:tc>
+          <w:tcPr>
+            <w:tcBorders>
+              <w:top w:val="single" w:sz="4" w:space="0" w:color="000000"/>
+              <w:left w:val="single" w:sz="4" w:space="0" w:color="000000"/>
+              <w:bottom w:val="single" w:sz="4" w:space="0" w:color="000000"/>
+              <w:right w:val="single" w:sz="4" w:space="0" w:color="000000"/>
+            </w:tcBorders>
+          </w:tcPr>
+          <w:p>
+            <w:pPr>
+              <w:pStyle w:val="Compact"/>
+            </w:pPr>
+          </w:p>
+        </w:tc>
+        <w:tc>
+          <w:tcPr>
+            <w:tcBorders>
+              <w:top w:val="single" w:sz="4" w:space="0" w:color="000000"/>
+              <w:left w:val="single" w:sz="4" w:space="0" w:color="000000"/>
+              <w:bottom w:val="single" w:sz="4" w:space="0" w:color="000000"/>
+              <w:right w:val="single" w:sz="4" w:space="0" w:color="000000"/>
+            </w:tcBorders>
+          </w:tcPr>
+          <w:p>
+            <w:pPr>
+              <w:pStyle w:val="Compact"/>
+            </w:pPr>
+          </w:p>
+        </w:tc>
+        <w:tc>
+          <w:tcPr>
+            <w:tcBorders>
+              <w:top w:val="single" w:sz="4" w:space="0" w:color="000000"/>
+              <w:left w:val="single" w:sz="4" w:space="0" w:color="000000"/>
+              <w:bottom w:val="single" w:sz="4" w:space="0" w:color="000000"/>
+              <w:right w:val="single" w:sz="4" w:space="0" w:color="000000"/>
+            </w:tcBorders>
+          </w:tcPr>
+          <w:p>
+            <w:pPr>
+              <w:pStyle w:val="Compact"/>
+            </w:pPr>
+          </w:p>
+        </w:tc>
+        <w:tc>
+          <w:tcPr>
             <w:tcBorders>
               <w:top w:val="single" w:sz="4" w:space="0" w:color="000000"/>
               <w:left w:val="single" w:sz="4" w:space="0" w:color="000000"/>
@@ -3593,13 +2897,13 @@
       </w:r>
     </w:p>
     <w:bookmarkEnd w:id="19"/>
-    <w:bookmarkStart w:id="20" w:name="Xc30318e2dce562564b8037d7599d658f2766c21"/>
+    <w:bookmarkStart w:id="20" w:name="X9c7d0e684e850254b4c9f4e26eb7de91889eeb3"/>
     <w:p>
       <w:pPr>
         <w:pStyle w:val="Heading2"/>
       </w:pPr>
       <w:r>
-        <w:t xml:space="preserve">Notas de retroalimentación entre pares (15:45-16:00)</w:t>
+        <w:t xml:space="preserve">Notas de retroalimentación entre pares (15:15-15:30)</w:t>
       </w:r>
     </w:p>
     <w:p>
@@ -3717,12 +3021,6 @@
               <w:bottom w:val="single" w:sz="4" w:space="0" w:color="000000"/>
               <w:right w:val="single" w:sz="4" w:space="0" w:color="000000"/>
             </w:tcBorders>
-            <w:tcBorders>
-              <w:top w:val="single" w:sz="4" w:space="0" w:color="000000"/>
-              <w:left w:val="single" w:sz="4" w:space="0" w:color="000000"/>
-              <w:bottom w:val="single" w:sz="4" w:space="0" w:color="000000"/>
-              <w:right w:val="single" w:sz="4" w:space="0" w:color="000000"/>
-            </w:tcBorders>
           </w:tcPr>
           <w:p>
             <w:pPr>
@@ -3735,12 +3033,6 @@
         </w:tc>
         <w:tc>
           <w:tcPr>
-            <w:tcBorders>
-              <w:top w:val="single" w:sz="4" w:space="0" w:color="000000"/>
-              <w:left w:val="single" w:sz="4" w:space="0" w:color="000000"/>
-              <w:bottom w:val="single" w:sz="4" w:space="0" w:color="000000"/>
-              <w:right w:val="single" w:sz="4" w:space="0" w:color="000000"/>
-            </w:tcBorders>
             <w:tcBorders>
               <w:top w:val="single" w:sz="4" w:space="0" w:color="000000"/>
               <w:left w:val="single" w:sz="4" w:space="0" w:color="000000"/>
@@ -3761,12 +3053,6 @@
       <w:tr>
         <w:tc>
           <w:tcPr>
-            <w:tcBorders>
-              <w:top w:val="single" w:sz="4" w:space="0" w:color="000000"/>
-              <w:left w:val="single" w:sz="4" w:space="0" w:color="000000"/>
-              <w:bottom w:val="single" w:sz="4" w:space="0" w:color="000000"/>
-              <w:right w:val="single" w:sz="4" w:space="0" w:color="000000"/>
-            </w:tcBorders>
             <w:tcBorders>
               <w:top w:val="single" w:sz="4" w:space="0" w:color="000000"/>
               <w:left w:val="single" w:sz="4" w:space="0" w:color="000000"/>
@@ -3795,12 +3081,6 @@
               <w:bottom w:val="single" w:sz="4" w:space="0" w:color="000000"/>
               <w:right w:val="single" w:sz="4" w:space="0" w:color="000000"/>
             </w:tcBorders>
-            <w:tcBorders>
-              <w:top w:val="single" w:sz="4" w:space="0" w:color="000000"/>
-              <w:left w:val="single" w:sz="4" w:space="0" w:color="000000"/>
-              <w:bottom w:val="single" w:sz="4" w:space="0" w:color="000000"/>
-              <w:right w:val="single" w:sz="4" w:space="0" w:color="000000"/>
-            </w:tcBorders>
           </w:tcPr>
           <w:p>
             <w:pPr>
@@ -3815,12 +3095,6 @@
       <w:tr>
         <w:tc>
           <w:tcPr>
-            <w:tcBorders>
-              <w:top w:val="single" w:sz="4" w:space="0" w:color="000000"/>
-              <w:left w:val="single" w:sz="4" w:space="0" w:color="000000"/>
-              <w:bottom w:val="single" w:sz="4" w:space="0" w:color="000000"/>
-              <w:right w:val="single" w:sz="4" w:space="0" w:color="000000"/>
-            </w:tcBorders>
             <w:tcBorders>
               <w:top w:val="single" w:sz="4" w:space="0" w:color="000000"/>
               <w:left w:val="single" w:sz="4" w:space="0" w:color="000000"/>
@@ -3849,12 +3123,6 @@
               <w:bottom w:val="single" w:sz="4" w:space="0" w:color="000000"/>
               <w:right w:val="single" w:sz="4" w:space="0" w:color="000000"/>
             </w:tcBorders>
-            <w:tcBorders>
-              <w:top w:val="single" w:sz="4" w:space="0" w:color="000000"/>
-              <w:left w:val="single" w:sz="4" w:space="0" w:color="000000"/>
-              <w:bottom w:val="single" w:sz="4" w:space="0" w:color="000000"/>
-              <w:right w:val="single" w:sz="4" w:space="0" w:color="000000"/>
-            </w:tcBorders>
           </w:tcPr>
           <w:p>
             <w:pPr>
@@ -3869,12 +3137,6 @@
       <w:tr>
         <w:tc>
           <w:tcPr>
-            <w:tcBorders>
-              <w:top w:val="single" w:sz="4" w:space="0" w:color="000000"/>
-              <w:left w:val="single" w:sz="4" w:space="0" w:color="000000"/>
-              <w:bottom w:val="single" w:sz="4" w:space="0" w:color="000000"/>
-              <w:right w:val="single" w:sz="4" w:space="0" w:color="000000"/>
-            </w:tcBorders>
             <w:tcBorders>
               <w:top w:val="single" w:sz="4" w:space="0" w:color="000000"/>
               <w:left w:val="single" w:sz="4" w:space="0" w:color="000000"/>
@@ -3897,12 +3159,6 @@
         </w:tc>
         <w:tc>
           <w:tcPr>
-            <w:tcBorders>
-              <w:top w:val="single" w:sz="4" w:space="0" w:color="000000"/>
-              <w:left w:val="single" w:sz="4" w:space="0" w:color="000000"/>
-              <w:bottom w:val="single" w:sz="4" w:space="0" w:color="000000"/>
-              <w:right w:val="single" w:sz="4" w:space="0" w:color="000000"/>
-            </w:tcBorders>
             <w:tcBorders>
               <w:top w:val="single" w:sz="4" w:space="0" w:color="000000"/>
               <w:left w:val="single" w:sz="4" w:space="0" w:color="000000"/>
@@ -3995,12 +3251,6 @@
               <w:bottom w:val="single" w:sz="4" w:space="0" w:color="000000"/>
               <w:right w:val="single" w:sz="4" w:space="0" w:color="000000"/>
             </w:tcBorders>
-            <w:tcBorders>
-              <w:top w:val="single" w:sz="4" w:space="0" w:color="000000"/>
-              <w:left w:val="single" w:sz="4" w:space="0" w:color="000000"/>
-              <w:bottom w:val="single" w:sz="4" w:space="0" w:color="000000"/>
-              <w:right w:val="single" w:sz="4" w:space="0" w:color="000000"/>
-            </w:tcBorders>
           </w:tcPr>
           <w:p>
             <w:pPr>
@@ -4013,12 +3263,6 @@
         </w:tc>
         <w:tc>
           <w:tcPr>
-            <w:tcBorders>
-              <w:top w:val="single" w:sz="4" w:space="0" w:color="000000"/>
-              <w:left w:val="single" w:sz="4" w:space="0" w:color="000000"/>
-              <w:bottom w:val="single" w:sz="4" w:space="0" w:color="000000"/>
-              <w:right w:val="single" w:sz="4" w:space="0" w:color="000000"/>
-            </w:tcBorders>
             <w:tcBorders>
               <w:top w:val="single" w:sz="4" w:space="0" w:color="000000"/>
               <w:left w:val="single" w:sz="4" w:space="0" w:color="000000"/>
@@ -4039,12 +3283,6 @@
       <w:tr>
         <w:tc>
           <w:tcPr>
-            <w:tcBorders>
-              <w:top w:val="single" w:sz="4" w:space="0" w:color="000000"/>
-              <w:left w:val="single" w:sz="4" w:space="0" w:color="000000"/>
-              <w:bottom w:val="single" w:sz="4" w:space="0" w:color="000000"/>
-              <w:right w:val="single" w:sz="4" w:space="0" w:color="000000"/>
-            </w:tcBorders>
             <w:tcBorders>
               <w:top w:val="single" w:sz="4" w:space="0" w:color="000000"/>
               <w:left w:val="single" w:sz="4" w:space="0" w:color="000000"/>
@@ -4073,12 +3311,6 @@
               <w:bottom w:val="single" w:sz="4" w:space="0" w:color="000000"/>
               <w:right w:val="single" w:sz="4" w:space="0" w:color="000000"/>
             </w:tcBorders>
-            <w:tcBorders>
-              <w:top w:val="single" w:sz="4" w:space="0" w:color="000000"/>
-              <w:left w:val="single" w:sz="4" w:space="0" w:color="000000"/>
-              <w:bottom w:val="single" w:sz="4" w:space="0" w:color="000000"/>
-              <w:right w:val="single" w:sz="4" w:space="0" w:color="000000"/>
-            </w:tcBorders>
           </w:tcPr>
           <w:p>
             <w:pPr>
@@ -4093,12 +3325,6 @@
       <w:tr>
         <w:tc>
           <w:tcPr>
-            <w:tcBorders>
-              <w:top w:val="single" w:sz="4" w:space="0" w:color="000000"/>
-              <w:left w:val="single" w:sz="4" w:space="0" w:color="000000"/>
-              <w:bottom w:val="single" w:sz="4" w:space="0" w:color="000000"/>
-              <w:right w:val="single" w:sz="4" w:space="0" w:color="000000"/>
-            </w:tcBorders>
             <w:tcBorders>
               <w:top w:val="single" w:sz="4" w:space="0" w:color="000000"/>
               <w:left w:val="single" w:sz="4" w:space="0" w:color="000000"/>
@@ -4127,12 +3353,6 @@
               <w:bottom w:val="single" w:sz="4" w:space="0" w:color="000000"/>
               <w:right w:val="single" w:sz="4" w:space="0" w:color="000000"/>
             </w:tcBorders>
-            <w:tcBorders>
-              <w:top w:val="single" w:sz="4" w:space="0" w:color="000000"/>
-              <w:left w:val="single" w:sz="4" w:space="0" w:color="000000"/>
-              <w:bottom w:val="single" w:sz="4" w:space="0" w:color="000000"/>
-              <w:right w:val="single" w:sz="4" w:space="0" w:color="000000"/>
-            </w:tcBorders>
           </w:tcPr>
           <w:p>
             <w:pPr>
@@ -4147,12 +3367,6 @@
       <w:tr>
         <w:tc>
           <w:tcPr>
-            <w:tcBorders>
-              <w:top w:val="single" w:sz="4" w:space="0" w:color="000000"/>
-              <w:left w:val="single" w:sz="4" w:space="0" w:color="000000"/>
-              <w:bottom w:val="single" w:sz="4" w:space="0" w:color="000000"/>
-              <w:right w:val="single" w:sz="4" w:space="0" w:color="000000"/>
-            </w:tcBorders>
             <w:tcBorders>
               <w:top w:val="single" w:sz="4" w:space="0" w:color="000000"/>
               <w:left w:val="single" w:sz="4" w:space="0" w:color="000000"/>
@@ -4175,12 +3389,6 @@
         </w:tc>
         <w:tc>
           <w:tcPr>
-            <w:tcBorders>
-              <w:top w:val="single" w:sz="4" w:space="0" w:color="000000"/>
-              <w:left w:val="single" w:sz="4" w:space="0" w:color="000000"/>
-              <w:bottom w:val="single" w:sz="4" w:space="0" w:color="000000"/>
-              <w:right w:val="single" w:sz="4" w:space="0" w:color="000000"/>
-            </w:tcBorders>
             <w:tcBorders>
               <w:top w:val="single" w:sz="4" w:space="0" w:color="000000"/>
               <w:left w:val="single" w:sz="4" w:space="0" w:color="000000"/>

</xml_diff>

<commit_message>
Actualiza niveles Tec Plantilla 4
</commit_message>
<xml_diff>
--- a/plantillas/Plantilla_4_MatrizIndicadores.docx
+++ b/plantillas/Plantilla_4_MatrizIndicadores.docx
@@ -3069,7 +3069,7 @@
                 <w:b/>
                 <w:bCs/>
               </w:rPr>
-              <w:t xml:space="preserve">3 - Sólido</w:t>
+              <w:t xml:space="preserve">4 - Destacado</w:t>
             </w:r>
           </w:p>
         </w:tc>
@@ -3111,7 +3111,7 @@
                 <w:b/>
                 <w:bCs/>
               </w:rPr>
-              <w:t xml:space="preserve">2 - En desarrollo</w:t>
+              <w:t xml:space="preserve">3 - Sólido</w:t>
             </w:r>
           </w:p>
         </w:tc>
@@ -3153,7 +3153,7 @@
                 <w:b/>
                 <w:bCs/>
               </w:rPr>
-              <w:t xml:space="preserve">1 - Inicial</w:t>
+              <w:t xml:space="preserve">2 - Básico</w:t>
             </w:r>
           </w:p>
         </w:tc>
@@ -3299,7 +3299,7 @@
                 <w:b/>
                 <w:bCs/>
               </w:rPr>
-              <w:t xml:space="preserve">3 - Sólido</w:t>
+              <w:t xml:space="preserve">4 - Destacado</w:t>
             </w:r>
           </w:p>
         </w:tc>
@@ -3341,7 +3341,7 @@
                 <w:b/>
                 <w:bCs/>
               </w:rPr>
-              <w:t xml:space="preserve">2 - En desarrollo</w:t>
+              <w:t xml:space="preserve">3 - Sólido</w:t>
             </w:r>
           </w:p>
         </w:tc>
@@ -3383,7 +3383,7 @@
                 <w:b/>
                 <w:bCs/>
               </w:rPr>
-              <w:t xml:space="preserve">1 - Inicial</w:t>
+              <w:t xml:space="preserve">2 - Básico</w:t>
             </w:r>
           </w:p>
         </w:tc>

</xml_diff>